<commit_message>
docs(srs): actualizar SRS a versión 1.3
</commit_message>
<xml_diff>
--- a/docs/SRS_AS-RS.docx
+++ b/docs/SRS_AS-RS.docx
@@ -64,7 +64,8 @@
     </w:p>
     <w:tbl>
       <w:tblPr>
-        <w:tblW w:w="9360" w:type="dxa"/>
+        <w:tblW w:w="8185" w:type="dxa"/>
+        <w:jc w:val="center"/>
         <w:tblBorders>
           <w:top w:val="single" w:sz="4" w:space="0" w:color="auto"/>
           <w:left w:val="single" w:sz="4" w:space="0" w:color="auto"/>
@@ -77,22 +78,19 @@
           <w:left w:w="10" w:type="dxa"/>
           <w:right w:w="10" w:type="dxa"/>
         </w:tblCellMar>
-        <w:tblLook w:val="04A0" w:firstRow="1" w:lastRow="0" w:firstColumn="1" w:lastColumn="0" w:noHBand="0" w:noVBand="1"/>
+        <w:tblLook w:val="0000" w:firstRow="0" w:lastRow="0" w:firstColumn="0" w:lastColumn="0" w:noHBand="0" w:noVBand="0"/>
       </w:tblPr>
       <w:tblGrid>
-        <w:gridCol w:w="3120"/>
-        <w:gridCol w:w="6240"/>
+        <w:gridCol w:w="2014"/>
+        <w:gridCol w:w="6171"/>
       </w:tblGrid>
       <w:tr>
-        <w:tblPrEx>
-          <w:tblCellMar>
-            <w:top w:w="0" w:type="dxa"/>
-            <w:bottom w:w="0" w:type="dxa"/>
-          </w:tblCellMar>
-        </w:tblPrEx>
-        <w:tc>
-          <w:tcPr>
-            <w:tcW w:w="3120" w:type="dxa"/>
+        <w:trPr>
+          <w:jc w:val="center"/>
+        </w:trPr>
+        <w:tc>
+          <w:tcPr>
+            <w:tcW w:w="2014" w:type="dxa"/>
             <w:tcBorders>
               <w:top w:val="single" w:sz="4" w:space="0" w:color="BFBFBF"/>
               <w:left w:val="single" w:sz="4" w:space="0" w:color="BFBFBF"/>
@@ -122,7 +120,7 @@
         </w:tc>
         <w:tc>
           <w:tcPr>
-            <w:tcW w:w="6240" w:type="dxa"/>
+            <w:tcW w:w="6171" w:type="dxa"/>
             <w:tcBorders>
               <w:top w:val="single" w:sz="4" w:space="0" w:color="BFBFBF"/>
               <w:left w:val="single" w:sz="4" w:space="0" w:color="BFBFBF"/>
@@ -155,15 +153,12 @@
         </w:tc>
       </w:tr>
       <w:tr>
-        <w:tblPrEx>
-          <w:tblCellMar>
-            <w:top w:w="0" w:type="dxa"/>
-            <w:bottom w:w="0" w:type="dxa"/>
-          </w:tblCellMar>
-        </w:tblPrEx>
-        <w:tc>
-          <w:tcPr>
-            <w:tcW w:w="3120" w:type="dxa"/>
+        <w:trPr>
+          <w:jc w:val="center"/>
+        </w:trPr>
+        <w:tc>
+          <w:tcPr>
+            <w:tcW w:w="2014" w:type="dxa"/>
             <w:tcBorders>
               <w:top w:val="single" w:sz="4" w:space="0" w:color="BFBFBF"/>
               <w:left w:val="single" w:sz="4" w:space="0" w:color="BFBFBF"/>
@@ -195,7 +190,7 @@
         </w:tc>
         <w:tc>
           <w:tcPr>
-            <w:tcW w:w="6240" w:type="dxa"/>
+            <w:tcW w:w="6171" w:type="dxa"/>
             <w:tcBorders>
               <w:top w:val="single" w:sz="4" w:space="0" w:color="BFBFBF"/>
               <w:left w:val="single" w:sz="4" w:space="0" w:color="BFBFBF"/>
@@ -231,15 +226,12 @@
         </w:tc>
       </w:tr>
       <w:tr>
-        <w:tblPrEx>
-          <w:tblCellMar>
-            <w:top w:w="0" w:type="dxa"/>
-            <w:bottom w:w="0" w:type="dxa"/>
-          </w:tblCellMar>
-        </w:tblPrEx>
-        <w:tc>
-          <w:tcPr>
-            <w:tcW w:w="3120" w:type="dxa"/>
+        <w:trPr>
+          <w:jc w:val="center"/>
+        </w:trPr>
+        <w:tc>
+          <w:tcPr>
+            <w:tcW w:w="2014" w:type="dxa"/>
             <w:tcBorders>
               <w:top w:val="single" w:sz="4" w:space="0" w:color="BFBFBF"/>
               <w:left w:val="single" w:sz="4" w:space="0" w:color="BFBFBF"/>
@@ -271,7 +263,7 @@
         </w:tc>
         <w:tc>
           <w:tcPr>
-            <w:tcW w:w="6240" w:type="dxa"/>
+            <w:tcW w:w="6171" w:type="dxa"/>
             <w:tcBorders>
               <w:top w:val="single" w:sz="4" w:space="0" w:color="BFBFBF"/>
               <w:left w:val="single" w:sz="4" w:space="0" w:color="BFBFBF"/>
@@ -304,15 +296,12 @@
         </w:tc>
       </w:tr>
       <w:tr>
-        <w:tblPrEx>
-          <w:tblCellMar>
-            <w:top w:w="0" w:type="dxa"/>
-            <w:bottom w:w="0" w:type="dxa"/>
-          </w:tblCellMar>
-        </w:tblPrEx>
-        <w:tc>
-          <w:tcPr>
-            <w:tcW w:w="3120" w:type="dxa"/>
+        <w:trPr>
+          <w:jc w:val="center"/>
+        </w:trPr>
+        <w:tc>
+          <w:tcPr>
+            <w:tcW w:w="2014" w:type="dxa"/>
             <w:tcBorders>
               <w:top w:val="single" w:sz="4" w:space="0" w:color="BFBFBF"/>
               <w:left w:val="single" w:sz="4" w:space="0" w:color="BFBFBF"/>
@@ -364,7 +353,7 @@
         </w:tc>
         <w:tc>
           <w:tcPr>
-            <w:tcW w:w="6240" w:type="dxa"/>
+            <w:tcW w:w="6171" w:type="dxa"/>
             <w:tcBorders>
               <w:top w:val="single" w:sz="4" w:space="0" w:color="BFBFBF"/>
               <w:left w:val="single" w:sz="4" w:space="0" w:color="BFBFBF"/>
@@ -391,15 +380,12 @@
         </w:tc>
       </w:tr>
       <w:tr>
-        <w:tblPrEx>
-          <w:tblCellMar>
-            <w:top w:w="0" w:type="dxa"/>
-            <w:bottom w:w="0" w:type="dxa"/>
-          </w:tblCellMar>
-        </w:tblPrEx>
-        <w:tc>
-          <w:tcPr>
-            <w:tcW w:w="3120" w:type="dxa"/>
+        <w:trPr>
+          <w:jc w:val="center"/>
+        </w:trPr>
+        <w:tc>
+          <w:tcPr>
+            <w:tcW w:w="2014" w:type="dxa"/>
             <w:tcBorders>
               <w:top w:val="single" w:sz="4" w:space="0" w:color="BFBFBF"/>
               <w:left w:val="single" w:sz="4" w:space="0" w:color="BFBFBF"/>
@@ -431,7 +417,7 @@
         </w:tc>
         <w:tc>
           <w:tcPr>
-            <w:tcW w:w="6240" w:type="dxa"/>
+            <w:tcW w:w="6171" w:type="dxa"/>
             <w:tcBorders>
               <w:top w:val="single" w:sz="4" w:space="0" w:color="BFBFBF"/>
               <w:left w:val="single" w:sz="4" w:space="0" w:color="BFBFBF"/>
@@ -464,15 +450,12 @@
         </w:tc>
       </w:tr>
       <w:tr>
-        <w:tblPrEx>
-          <w:tblCellMar>
-            <w:top w:w="0" w:type="dxa"/>
-            <w:bottom w:w="0" w:type="dxa"/>
-          </w:tblCellMar>
-        </w:tblPrEx>
-        <w:tc>
-          <w:tcPr>
-            <w:tcW w:w="3120" w:type="dxa"/>
+        <w:trPr>
+          <w:jc w:val="center"/>
+        </w:trPr>
+        <w:tc>
+          <w:tcPr>
+            <w:tcW w:w="2014" w:type="dxa"/>
             <w:tcBorders>
               <w:top w:val="single" w:sz="4" w:space="0" w:color="BFBFBF"/>
               <w:left w:val="single" w:sz="4" w:space="0" w:color="BFBFBF"/>
@@ -504,7 +487,7 @@
         </w:tc>
         <w:tc>
           <w:tcPr>
-            <w:tcW w:w="6240" w:type="dxa"/>
+            <w:tcW w:w="6171" w:type="dxa"/>
             <w:tcBorders>
               <w:top w:val="single" w:sz="4" w:space="0" w:color="BFBFBF"/>
               <w:left w:val="single" w:sz="4" w:space="0" w:color="BFBFBF"/>
@@ -531,15 +514,12 @@
         </w:tc>
       </w:tr>
       <w:tr>
-        <w:tblPrEx>
-          <w:tblCellMar>
-            <w:top w:w="0" w:type="dxa"/>
-            <w:bottom w:w="0" w:type="dxa"/>
-          </w:tblCellMar>
-        </w:tblPrEx>
-        <w:tc>
-          <w:tcPr>
-            <w:tcW w:w="3120" w:type="dxa"/>
+        <w:trPr>
+          <w:jc w:val="center"/>
+        </w:trPr>
+        <w:tc>
+          <w:tcPr>
+            <w:tcW w:w="2014" w:type="dxa"/>
             <w:tcBorders>
               <w:top w:val="single" w:sz="4" w:space="0" w:color="BFBFBF"/>
               <w:left w:val="single" w:sz="4" w:space="0" w:color="BFBFBF"/>
@@ -569,7 +549,7 @@
         </w:tc>
         <w:tc>
           <w:tcPr>
-            <w:tcW w:w="6240" w:type="dxa"/>
+            <w:tcW w:w="6171" w:type="dxa"/>
             <w:tcBorders>
               <w:top w:val="single" w:sz="4" w:space="0" w:color="BFBFBF"/>
               <w:left w:val="single" w:sz="4" w:space="0" w:color="BFBFBF"/>
@@ -596,15 +576,12 @@
         </w:tc>
       </w:tr>
       <w:tr>
-        <w:tblPrEx>
-          <w:tblCellMar>
-            <w:top w:w="0" w:type="dxa"/>
-            <w:bottom w:w="0" w:type="dxa"/>
-          </w:tblCellMar>
-        </w:tblPrEx>
-        <w:tc>
-          <w:tcPr>
-            <w:tcW w:w="3120" w:type="dxa"/>
+        <w:trPr>
+          <w:jc w:val="center"/>
+        </w:trPr>
+        <w:tc>
+          <w:tcPr>
+            <w:tcW w:w="2014" w:type="dxa"/>
             <w:tcBorders>
               <w:top w:val="single" w:sz="4" w:space="0" w:color="BFBFBF"/>
               <w:left w:val="single" w:sz="4" w:space="0" w:color="BFBFBF"/>
@@ -634,7 +611,7 @@
         </w:tc>
         <w:tc>
           <w:tcPr>
-            <w:tcW w:w="6240" w:type="dxa"/>
+            <w:tcW w:w="6171" w:type="dxa"/>
             <w:tcBorders>
               <w:top w:val="single" w:sz="4" w:space="0" w:color="BFBFBF"/>
               <w:left w:val="single" w:sz="4" w:space="0" w:color="BFBFBF"/>
@@ -670,15 +647,12 @@
         </w:tc>
       </w:tr>
       <w:tr>
-        <w:tblPrEx>
-          <w:tblCellMar>
-            <w:top w:w="0" w:type="dxa"/>
-            <w:bottom w:w="0" w:type="dxa"/>
-          </w:tblCellMar>
-        </w:tblPrEx>
-        <w:tc>
-          <w:tcPr>
-            <w:tcW w:w="3120" w:type="dxa"/>
+        <w:trPr>
+          <w:jc w:val="center"/>
+        </w:trPr>
+        <w:tc>
+          <w:tcPr>
+            <w:tcW w:w="2014" w:type="dxa"/>
             <w:tcBorders>
               <w:top w:val="single" w:sz="4" w:space="0" w:color="BFBFBF"/>
               <w:left w:val="single" w:sz="4" w:space="0" w:color="BFBFBF"/>
@@ -708,7 +682,7 @@
         </w:tc>
         <w:tc>
           <w:tcPr>
-            <w:tcW w:w="6240" w:type="dxa"/>
+            <w:tcW w:w="6171" w:type="dxa"/>
             <w:tcBorders>
               <w:top w:val="single" w:sz="4" w:space="0" w:color="BFBFBF"/>
               <w:left w:val="single" w:sz="4" w:space="0" w:color="BFBFBF"/>
@@ -735,15 +709,12 @@
         </w:tc>
       </w:tr>
       <w:tr>
-        <w:tblPrEx>
-          <w:tblCellMar>
-            <w:top w:w="0" w:type="dxa"/>
-            <w:bottom w:w="0" w:type="dxa"/>
-          </w:tblCellMar>
-        </w:tblPrEx>
-        <w:tc>
-          <w:tcPr>
-            <w:tcW w:w="3120" w:type="dxa"/>
+        <w:trPr>
+          <w:jc w:val="center"/>
+        </w:trPr>
+        <w:tc>
+          <w:tcPr>
+            <w:tcW w:w="2014" w:type="dxa"/>
             <w:tcBorders>
               <w:top w:val="single" w:sz="4" w:space="0" w:color="BFBFBF"/>
               <w:left w:val="single" w:sz="4" w:space="0" w:color="BFBFBF"/>
@@ -773,7 +744,7 @@
         </w:tc>
         <w:tc>
           <w:tcPr>
-            <w:tcW w:w="6240" w:type="dxa"/>
+            <w:tcW w:w="6171" w:type="dxa"/>
             <w:tcBorders>
               <w:top w:val="single" w:sz="4" w:space="0" w:color="BFBFBF"/>
               <w:left w:val="single" w:sz="4" w:space="0" w:color="BFBFBF"/>
@@ -801,7 +772,15 @@
       </w:tr>
     </w:tbl>
     <w:p>
-      <w:r>
+      <w:pPr>
+        <w:rPr>
+          <w:lang w:val="es-CO"/>
+        </w:rPr>
+      </w:pPr>
+      <w:r>
+        <w:rPr>
+          <w:lang w:val="es-CO"/>
+        </w:rPr>
         <w:br w:type="page"/>
       </w:r>
     </w:p>
@@ -835,7 +814,7 @@
           <w:left w:w="10" w:type="dxa"/>
           <w:right w:w="10" w:type="dxa"/>
         </w:tblCellMar>
-        <w:tblLook w:val="04A0" w:firstRow="1" w:lastRow="0" w:firstColumn="1" w:lastColumn="0" w:noHBand="0" w:noVBand="1"/>
+        <w:tblLook w:val="0000" w:firstRow="0" w:lastRow="0" w:firstColumn="0" w:lastColumn="0" w:noHBand="0" w:noVBand="0"/>
       </w:tblPr>
       <w:tblGrid>
         <w:gridCol w:w="1400"/>
@@ -844,12 +823,6 @@
         <w:gridCol w:w="3760"/>
       </w:tblGrid>
       <w:tr>
-        <w:tblPrEx>
-          <w:tblCellMar>
-            <w:top w:w="0" w:type="dxa"/>
-            <w:bottom w:w="0" w:type="dxa"/>
-          </w:tblCellMar>
-        </w:tblPrEx>
         <w:trPr>
           <w:tblHeader/>
         </w:trPr>
@@ -985,12 +958,6 @@
         </w:tc>
       </w:tr>
       <w:tr>
-        <w:tblPrEx>
-          <w:tblCellMar>
-            <w:top w:w="0" w:type="dxa"/>
-            <w:bottom w:w="0" w:type="dxa"/>
-          </w:tblCellMar>
-        </w:tblPrEx>
         <w:tc>
           <w:tcPr>
             <w:tcW w:w="1400" w:type="dxa"/>
@@ -1102,6 +1069,274 @@
                 <w:lang w:val="es-CO"/>
               </w:rPr>
               <w:t>Versión inicial del SRS, Plan de Pruebas, plantilla de TC y SRTM.</w:t>
+            </w:r>
+          </w:p>
+        </w:tc>
+      </w:tr>
+      <w:tr>
+        <w:tc>
+          <w:tcPr>
+            <w:tcW w:w="1400" w:type="dxa"/>
+            <w:tcBorders>
+              <w:top w:val="single" w:sz="4" w:space="0" w:color="BFBFBF"/>
+              <w:left w:val="single" w:sz="4" w:space="0" w:color="BFBFBF"/>
+              <w:bottom w:val="single" w:sz="4" w:space="0" w:color="BFBFBF"/>
+              <w:right w:val="single" w:sz="4" w:space="0" w:color="BFBFBF"/>
+            </w:tcBorders>
+            <w:tcMar>
+              <w:top w:w="80" w:type="dxa"/>
+              <w:left w:w="120" w:type="dxa"/>
+              <w:bottom w:w="80" w:type="dxa"/>
+              <w:right w:w="120" w:type="dxa"/>
+            </w:tcMar>
+            <w:vAlign w:val="center"/>
+          </w:tcPr>
+          <w:p>
+            <w:r>
+              <w:rPr>
+                <w:sz w:val="20"/>
+                <w:szCs w:val="20"/>
+              </w:rPr>
+              <w:t>1.1</w:t>
+            </w:r>
+          </w:p>
+        </w:tc>
+        <w:tc>
+          <w:tcPr>
+            <w:tcW w:w="1800" w:type="dxa"/>
+            <w:tcBorders>
+              <w:top w:val="single" w:sz="4" w:space="0" w:color="BFBFBF"/>
+              <w:left w:val="single" w:sz="4" w:space="0" w:color="BFBFBF"/>
+              <w:bottom w:val="single" w:sz="4" w:space="0" w:color="BFBFBF"/>
+              <w:right w:val="single" w:sz="4" w:space="0" w:color="BFBFBF"/>
+            </w:tcBorders>
+            <w:tcMar>
+              <w:top w:w="80" w:type="dxa"/>
+              <w:left w:w="120" w:type="dxa"/>
+              <w:bottom w:w="80" w:type="dxa"/>
+              <w:right w:w="120" w:type="dxa"/>
+            </w:tcMar>
+            <w:vAlign w:val="center"/>
+          </w:tcPr>
+          <w:p>
+            <w:r>
+              <w:rPr>
+                <w:sz w:val="20"/>
+                <w:szCs w:val="20"/>
+              </w:rPr>
+              <w:t>2026-04-16</w:t>
+            </w:r>
+          </w:p>
+        </w:tc>
+        <w:tc>
+          <w:tcPr>
+            <w:tcW w:w="2400" w:type="dxa"/>
+            <w:tcBorders>
+              <w:top w:val="single" w:sz="4" w:space="0" w:color="BFBFBF"/>
+              <w:left w:val="single" w:sz="4" w:space="0" w:color="BFBFBF"/>
+              <w:bottom w:val="single" w:sz="4" w:space="0" w:color="BFBFBF"/>
+              <w:right w:val="single" w:sz="4" w:space="0" w:color="BFBFBF"/>
+            </w:tcBorders>
+            <w:tcMar>
+              <w:top w:w="80" w:type="dxa"/>
+              <w:left w:w="120" w:type="dxa"/>
+              <w:bottom w:w="80" w:type="dxa"/>
+              <w:right w:w="120" w:type="dxa"/>
+            </w:tcMar>
+            <w:vAlign w:val="center"/>
+          </w:tcPr>
+          <w:p>
+            <w:r>
+              <w:rPr>
+                <w:sz w:val="20"/>
+                <w:szCs w:val="20"/>
+              </w:rPr>
+              <w:t>Technical Lead</w:t>
+            </w:r>
+          </w:p>
+        </w:tc>
+        <w:tc>
+          <w:tcPr>
+            <w:tcW w:w="3760" w:type="dxa"/>
+            <w:tcBorders>
+              <w:top w:val="single" w:sz="4" w:space="0" w:color="BFBFBF"/>
+              <w:left w:val="single" w:sz="4" w:space="0" w:color="BFBFBF"/>
+              <w:bottom w:val="single" w:sz="4" w:space="0" w:color="BFBFBF"/>
+              <w:right w:val="single" w:sz="4" w:space="0" w:color="BFBFBF"/>
+            </w:tcBorders>
+            <w:tcMar>
+              <w:top w:w="80" w:type="dxa"/>
+              <w:left w:w="120" w:type="dxa"/>
+              <w:bottom w:w="80" w:type="dxa"/>
+              <w:right w:w="120" w:type="dxa"/>
+            </w:tcMar>
+            <w:vAlign w:val="center"/>
+          </w:tcPr>
+          <w:p>
+            <w:pPr>
+              <w:rPr>
+                <w:lang w:val="es-CO"/>
+              </w:rPr>
+            </w:pPr>
+            <w:r>
+              <w:rPr>
+                <w:sz w:val="20"/>
+                <w:szCs w:val="20"/>
+                <w:lang w:val="es-CO"/>
+              </w:rPr>
+              <w:t>Actualización de RF-13 (Interfaz de usuario): definición inicial de la plataforma GUI pendiente.</w:t>
+            </w:r>
+          </w:p>
+        </w:tc>
+      </w:tr>
+      <w:tr>
+        <w:tc>
+          <w:tcPr>
+            <w:tcW w:w="1400" w:type="dxa"/>
+            <w:tcBorders>
+              <w:top w:val="single" w:sz="4" w:space="0" w:color="BFBFBF"/>
+              <w:left w:val="single" w:sz="4" w:space="0" w:color="BFBFBF"/>
+              <w:bottom w:val="single" w:sz="4" w:space="0" w:color="BFBFBF"/>
+              <w:right w:val="single" w:sz="4" w:space="0" w:color="BFBFBF"/>
+            </w:tcBorders>
+            <w:tcMar>
+              <w:top w:w="80" w:type="dxa"/>
+              <w:left w:w="120" w:type="dxa"/>
+              <w:bottom w:w="80" w:type="dxa"/>
+              <w:right w:w="120" w:type="dxa"/>
+            </w:tcMar>
+            <w:vAlign w:val="center"/>
+          </w:tcPr>
+          <w:p>
+            <w:r>
+              <w:rPr>
+                <w:sz w:val="20"/>
+                <w:szCs w:val="20"/>
+              </w:rPr>
+              <w:t>1.2</w:t>
+            </w:r>
+          </w:p>
+        </w:tc>
+        <w:tc>
+          <w:tcPr>
+            <w:tcW w:w="1800" w:type="dxa"/>
+            <w:tcBorders>
+              <w:top w:val="single" w:sz="4" w:space="0" w:color="BFBFBF"/>
+              <w:left w:val="single" w:sz="4" w:space="0" w:color="BFBFBF"/>
+              <w:bottom w:val="single" w:sz="4" w:space="0" w:color="BFBFBF"/>
+              <w:right w:val="single" w:sz="4" w:space="0" w:color="BFBFBF"/>
+            </w:tcBorders>
+            <w:tcMar>
+              <w:top w:w="80" w:type="dxa"/>
+              <w:left w:w="120" w:type="dxa"/>
+              <w:bottom w:w="80" w:type="dxa"/>
+              <w:right w:w="120" w:type="dxa"/>
+            </w:tcMar>
+            <w:vAlign w:val="center"/>
+          </w:tcPr>
+          <w:p>
+            <w:r>
+              <w:rPr>
+                <w:sz w:val="20"/>
+                <w:szCs w:val="20"/>
+              </w:rPr>
+              <w:t>2026-05-25</w:t>
+            </w:r>
+          </w:p>
+        </w:tc>
+        <w:tc>
+          <w:tcPr>
+            <w:tcW w:w="2400" w:type="dxa"/>
+            <w:tcBorders>
+              <w:top w:val="single" w:sz="4" w:space="0" w:color="BFBFBF"/>
+              <w:left w:val="single" w:sz="4" w:space="0" w:color="BFBFBF"/>
+              <w:bottom w:val="single" w:sz="4" w:space="0" w:color="BFBFBF"/>
+              <w:right w:val="single" w:sz="4" w:space="0" w:color="BFBFBF"/>
+            </w:tcBorders>
+            <w:tcMar>
+              <w:top w:w="80" w:type="dxa"/>
+              <w:left w:w="120" w:type="dxa"/>
+              <w:bottom w:w="80" w:type="dxa"/>
+              <w:right w:w="120" w:type="dxa"/>
+            </w:tcMar>
+            <w:vAlign w:val="center"/>
+          </w:tcPr>
+          <w:p>
+            <w:r>
+              <w:rPr>
+                <w:sz w:val="20"/>
+                <w:szCs w:val="20"/>
+              </w:rPr>
+              <w:t>Technical Lead</w:t>
+            </w:r>
+          </w:p>
+        </w:tc>
+        <w:tc>
+          <w:tcPr>
+            <w:tcW w:w="3760" w:type="dxa"/>
+            <w:tcBorders>
+              <w:top w:val="single" w:sz="4" w:space="0" w:color="BFBFBF"/>
+              <w:left w:val="single" w:sz="4" w:space="0" w:color="BFBFBF"/>
+              <w:bottom w:val="single" w:sz="4" w:space="0" w:color="BFBFBF"/>
+              <w:right w:val="single" w:sz="4" w:space="0" w:color="BFBFBF"/>
+            </w:tcBorders>
+            <w:tcMar>
+              <w:top w:w="80" w:type="dxa"/>
+              <w:left w:w="120" w:type="dxa"/>
+              <w:bottom w:w="80" w:type="dxa"/>
+              <w:right w:w="120" w:type="dxa"/>
+            </w:tcMar>
+            <w:vAlign w:val="center"/>
+          </w:tcPr>
+          <w:p>
+            <w:pPr>
+              <w:rPr>
+                <w:lang w:val="es-CO"/>
+              </w:rPr>
+            </w:pPr>
+            <w:r>
+              <w:rPr>
+                <w:sz w:val="20"/>
+                <w:szCs w:val="20"/>
+                <w:lang w:val="es-CO"/>
+              </w:rPr>
+              <w:t>RF-13 actualizado con definición completa (</w:t>
+            </w:r>
+            <w:proofErr w:type="gramStart"/>
+            <w:r>
+              <w:rPr>
+                <w:sz w:val="20"/>
+                <w:szCs w:val="20"/>
+                <w:lang w:val="es-CO"/>
+              </w:rPr>
+              <w:t>app</w:t>
+            </w:r>
+            <w:proofErr w:type="gramEnd"/>
+            <w:r>
+              <w:rPr>
+                <w:sz w:val="20"/>
+                <w:szCs w:val="20"/>
+                <w:lang w:val="es-CO"/>
+              </w:rPr>
+              <w:t xml:space="preserve"> escritorio Python/</w:t>
+            </w:r>
+            <w:proofErr w:type="spellStart"/>
+            <w:r>
+              <w:rPr>
+                <w:sz w:val="20"/>
+                <w:szCs w:val="20"/>
+                <w:lang w:val="es-CO"/>
+              </w:rPr>
+              <w:t>tkinter</w:t>
+            </w:r>
+            <w:proofErr w:type="spellEnd"/>
+            <w:r>
+              <w:rPr>
+                <w:sz w:val="20"/>
+                <w:szCs w:val="20"/>
+                <w:lang w:val="es-CO"/>
+              </w:rPr>
+              <w:t>, UART). RF-11 y RNF-06 suspendidos. Rango celda actualizado a 10–1000 g. RNF-02: criterio de aceptación de alimentación actualizado (prueba de estabilidad 60 s bajo carga máxima).</w:t>
             </w:r>
           </w:p>
         </w:tc>
@@ -1218,11 +1453,19 @@
           <w:lang w:val="es-CO"/>
         </w:rPr>
       </w:pPr>
+      <w:proofErr w:type="gramStart"/>
       <w:r>
         <w:rPr>
           <w:lang w:val="es-CO"/>
         </w:rPr>
-        <w:t xml:space="preserve">El sistema a desarrollar es un prototipo funcional, a escala, de un AS/RS compacto compuesto por una matriz cartesiana de 3 columnas × 4 filas (12 celdas), un </w:t>
+        <w:t>El sistema a desarrollar</w:t>
+      </w:r>
+      <w:proofErr w:type="gramEnd"/>
+      <w:r>
+        <w:rPr>
+          <w:lang w:val="es-CO"/>
+        </w:rPr>
+        <w:t xml:space="preserve"> es un prototipo funcional, a escala, de un AS/RS compacto compuesto por una matriz cartesiana de 3 columnas × 4 filas (12 celdas), un </w:t>
       </w:r>
       <w:proofErr w:type="spellStart"/>
       <w:r>
@@ -1910,19 +2153,13 @@
           <w:left w:w="10" w:type="dxa"/>
           <w:right w:w="10" w:type="dxa"/>
         </w:tblCellMar>
-        <w:tblLook w:val="04A0" w:firstRow="1" w:lastRow="0" w:firstColumn="1" w:lastColumn="0" w:noHBand="0" w:noVBand="1"/>
+        <w:tblLook w:val="0000" w:firstRow="0" w:lastRow="0" w:firstColumn="0" w:lastColumn="0" w:noHBand="0" w:noVBand="0"/>
       </w:tblPr>
       <w:tblGrid>
         <w:gridCol w:w="2400"/>
         <w:gridCol w:w="6960"/>
       </w:tblGrid>
       <w:tr>
-        <w:tblPrEx>
-          <w:tblCellMar>
-            <w:top w:w="0" w:type="dxa"/>
-            <w:bottom w:w="0" w:type="dxa"/>
-          </w:tblCellMar>
-        </w:tblPrEx>
         <w:tc>
           <w:tcPr>
             <w:tcW w:w="9360" w:type="dxa"/>
@@ -2000,12 +2237,6 @@
         </w:tc>
       </w:tr>
       <w:tr>
-        <w:tblPrEx>
-          <w:tblCellMar>
-            <w:top w:w="0" w:type="dxa"/>
-            <w:bottom w:w="0" w:type="dxa"/>
-          </w:tblCellMar>
-        </w:tblPrEx>
         <w:tc>
           <w:tcPr>
             <w:tcW w:w="2400" w:type="dxa"/>
@@ -2127,12 +2358,6 @@
         </w:tc>
       </w:tr>
       <w:tr>
-        <w:tblPrEx>
-          <w:tblCellMar>
-            <w:top w:w="0" w:type="dxa"/>
-            <w:bottom w:w="0" w:type="dxa"/>
-          </w:tblCellMar>
-        </w:tblPrEx>
         <w:tc>
           <w:tcPr>
             <w:tcW w:w="2400" w:type="dxa"/>
@@ -2274,12 +2499,6 @@
         </w:tc>
       </w:tr>
       <w:tr>
-        <w:tblPrEx>
-          <w:tblCellMar>
-            <w:top w:w="0" w:type="dxa"/>
-            <w:bottom w:w="0" w:type="dxa"/>
-          </w:tblCellMar>
-        </w:tblPrEx>
         <w:tc>
           <w:tcPr>
             <w:tcW w:w="2400" w:type="dxa"/>
@@ -2370,12 +2589,6 @@
         </w:tc>
       </w:tr>
       <w:tr>
-        <w:tblPrEx>
-          <w:tblCellMar>
-            <w:top w:w="0" w:type="dxa"/>
-            <w:bottom w:w="0" w:type="dxa"/>
-          </w:tblCellMar>
-        </w:tblPrEx>
         <w:tc>
           <w:tcPr>
             <w:tcW w:w="2400" w:type="dxa"/>
@@ -2466,19 +2679,13 @@
           <w:left w:w="10" w:type="dxa"/>
           <w:right w:w="10" w:type="dxa"/>
         </w:tblCellMar>
-        <w:tblLook w:val="04A0" w:firstRow="1" w:lastRow="0" w:firstColumn="1" w:lastColumn="0" w:noHBand="0" w:noVBand="1"/>
+        <w:tblLook w:val="0000" w:firstRow="0" w:lastRow="0" w:firstColumn="0" w:lastColumn="0" w:noHBand="0" w:noVBand="0"/>
       </w:tblPr>
       <w:tblGrid>
         <w:gridCol w:w="2400"/>
         <w:gridCol w:w="6960"/>
       </w:tblGrid>
       <w:tr>
-        <w:tblPrEx>
-          <w:tblCellMar>
-            <w:top w:w="0" w:type="dxa"/>
-            <w:bottom w:w="0" w:type="dxa"/>
-          </w:tblCellMar>
-        </w:tblPrEx>
         <w:tc>
           <w:tcPr>
             <w:tcW w:w="9360" w:type="dxa"/>
@@ -2556,12 +2763,6 @@
         </w:tc>
       </w:tr>
       <w:tr>
-        <w:tblPrEx>
-          <w:tblCellMar>
-            <w:top w:w="0" w:type="dxa"/>
-            <w:bottom w:w="0" w:type="dxa"/>
-          </w:tblCellMar>
-        </w:tblPrEx>
         <w:tc>
           <w:tcPr>
             <w:tcW w:w="2400" w:type="dxa"/>
@@ -2665,12 +2866,6 @@
         </w:tc>
       </w:tr>
       <w:tr>
-        <w:tblPrEx>
-          <w:tblCellMar>
-            <w:top w:w="0" w:type="dxa"/>
-            <w:bottom w:w="0" w:type="dxa"/>
-          </w:tblCellMar>
-        </w:tblPrEx>
         <w:tc>
           <w:tcPr>
             <w:tcW w:w="2400" w:type="dxa"/>
@@ -2792,12 +2987,6 @@
         </w:tc>
       </w:tr>
       <w:tr>
-        <w:tblPrEx>
-          <w:tblCellMar>
-            <w:top w:w="0" w:type="dxa"/>
-            <w:bottom w:w="0" w:type="dxa"/>
-          </w:tblCellMar>
-        </w:tblPrEx>
         <w:tc>
           <w:tcPr>
             <w:tcW w:w="2400" w:type="dxa"/>
@@ -2888,12 +3077,6 @@
         </w:tc>
       </w:tr>
       <w:tr>
-        <w:tblPrEx>
-          <w:tblCellMar>
-            <w:top w:w="0" w:type="dxa"/>
-            <w:bottom w:w="0" w:type="dxa"/>
-          </w:tblCellMar>
-        </w:tblPrEx>
         <w:tc>
           <w:tcPr>
             <w:tcW w:w="2400" w:type="dxa"/>
@@ -2984,19 +3167,13 @@
           <w:left w:w="10" w:type="dxa"/>
           <w:right w:w="10" w:type="dxa"/>
         </w:tblCellMar>
-        <w:tblLook w:val="04A0" w:firstRow="1" w:lastRow="0" w:firstColumn="1" w:lastColumn="0" w:noHBand="0" w:noVBand="1"/>
+        <w:tblLook w:val="0000" w:firstRow="0" w:lastRow="0" w:firstColumn="0" w:lastColumn="0" w:noHBand="0" w:noVBand="0"/>
       </w:tblPr>
       <w:tblGrid>
         <w:gridCol w:w="2400"/>
         <w:gridCol w:w="6960"/>
       </w:tblGrid>
       <w:tr>
-        <w:tblPrEx>
-          <w:tblCellMar>
-            <w:top w:w="0" w:type="dxa"/>
-            <w:bottom w:w="0" w:type="dxa"/>
-          </w:tblCellMar>
-        </w:tblPrEx>
         <w:tc>
           <w:tcPr>
             <w:tcW w:w="9360" w:type="dxa"/>
@@ -3028,18 +3205,32 @@
                 <w:color w:val="FFFFFF"/>
                 <w:lang w:val="es-CO"/>
               </w:rPr>
-              <w:t>RF-03  Operación de almacenamiento (STORE)</w:t>
+              <w:t>RF-</w:t>
+            </w:r>
+            <w:proofErr w:type="gramStart"/>
+            <w:r>
+              <w:rPr>
+                <w:b/>
+                <w:bCs/>
+                <w:color w:val="FFFFFF"/>
+                <w:lang w:val="es-CO"/>
+              </w:rPr>
+              <w:t>03  Operación</w:t>
+            </w:r>
+            <w:proofErr w:type="gramEnd"/>
+            <w:r>
+              <w:rPr>
+                <w:b/>
+                <w:bCs/>
+                <w:color w:val="FFFFFF"/>
+                <w:lang w:val="es-CO"/>
+              </w:rPr>
+              <w:t xml:space="preserve"> de almacenamiento (STORE)</w:t>
             </w:r>
           </w:p>
         </w:tc>
       </w:tr>
       <w:tr>
-        <w:tblPrEx>
-          <w:tblCellMar>
-            <w:top w:w="0" w:type="dxa"/>
-            <w:bottom w:w="0" w:type="dxa"/>
-          </w:tblCellMar>
-        </w:tblPrEx>
         <w:tc>
           <w:tcPr>
             <w:tcW w:w="2400" w:type="dxa"/>
@@ -3107,12 +3298,6 @@
         </w:tc>
       </w:tr>
       <w:tr>
-        <w:tblPrEx>
-          <w:tblCellMar>
-            <w:top w:w="0" w:type="dxa"/>
-            <w:bottom w:w="0" w:type="dxa"/>
-          </w:tblCellMar>
-        </w:tblPrEx>
         <w:tc>
           <w:tcPr>
             <w:tcW w:w="2400" w:type="dxa"/>
@@ -3218,12 +3403,6 @@
         </w:tc>
       </w:tr>
       <w:tr>
-        <w:tblPrEx>
-          <w:tblCellMar>
-            <w:top w:w="0" w:type="dxa"/>
-            <w:bottom w:w="0" w:type="dxa"/>
-          </w:tblCellMar>
-        </w:tblPrEx>
         <w:tc>
           <w:tcPr>
             <w:tcW w:w="2400" w:type="dxa"/>
@@ -3314,12 +3493,6 @@
         </w:tc>
       </w:tr>
       <w:tr>
-        <w:tblPrEx>
-          <w:tblCellMar>
-            <w:top w:w="0" w:type="dxa"/>
-            <w:bottom w:w="0" w:type="dxa"/>
-          </w:tblCellMar>
-        </w:tblPrEx>
         <w:tc>
           <w:tcPr>
             <w:tcW w:w="2400" w:type="dxa"/>
@@ -3410,19 +3583,13 @@
           <w:left w:w="10" w:type="dxa"/>
           <w:right w:w="10" w:type="dxa"/>
         </w:tblCellMar>
-        <w:tblLook w:val="04A0" w:firstRow="1" w:lastRow="0" w:firstColumn="1" w:lastColumn="0" w:noHBand="0" w:noVBand="1"/>
+        <w:tblLook w:val="0000" w:firstRow="0" w:lastRow="0" w:firstColumn="0" w:lastColumn="0" w:noHBand="0" w:noVBand="0"/>
       </w:tblPr>
       <w:tblGrid>
         <w:gridCol w:w="2400"/>
         <w:gridCol w:w="6960"/>
       </w:tblGrid>
       <w:tr>
-        <w:tblPrEx>
-          <w:tblCellMar>
-            <w:top w:w="0" w:type="dxa"/>
-            <w:bottom w:w="0" w:type="dxa"/>
-          </w:tblCellMar>
-        </w:tblPrEx>
         <w:tc>
           <w:tcPr>
             <w:tcW w:w="9360" w:type="dxa"/>
@@ -3480,12 +3647,6 @@
         </w:tc>
       </w:tr>
       <w:tr>
-        <w:tblPrEx>
-          <w:tblCellMar>
-            <w:top w:w="0" w:type="dxa"/>
-            <w:bottom w:w="0" w:type="dxa"/>
-          </w:tblCellMar>
-        </w:tblPrEx>
         <w:tc>
           <w:tcPr>
             <w:tcW w:w="2400" w:type="dxa"/>
@@ -3553,12 +3714,6 @@
         </w:tc>
       </w:tr>
       <w:tr>
-        <w:tblPrEx>
-          <w:tblCellMar>
-            <w:top w:w="0" w:type="dxa"/>
-            <w:bottom w:w="0" w:type="dxa"/>
-          </w:tblCellMar>
-        </w:tblPrEx>
         <w:tc>
           <w:tcPr>
             <w:tcW w:w="2400" w:type="dxa"/>
@@ -3682,12 +3837,6 @@
         </w:tc>
       </w:tr>
       <w:tr>
-        <w:tblPrEx>
-          <w:tblCellMar>
-            <w:top w:w="0" w:type="dxa"/>
-            <w:bottom w:w="0" w:type="dxa"/>
-          </w:tblCellMar>
-        </w:tblPrEx>
         <w:tc>
           <w:tcPr>
             <w:tcW w:w="2400" w:type="dxa"/>
@@ -3779,12 +3928,6 @@
         </w:tc>
       </w:tr>
       <w:tr>
-        <w:tblPrEx>
-          <w:tblCellMar>
-            <w:top w:w="0" w:type="dxa"/>
-            <w:bottom w:w="0" w:type="dxa"/>
-          </w:tblCellMar>
-        </w:tblPrEx>
         <w:tc>
           <w:tcPr>
             <w:tcW w:w="2400" w:type="dxa"/>
@@ -3875,19 +4018,13 @@
           <w:left w:w="10" w:type="dxa"/>
           <w:right w:w="10" w:type="dxa"/>
         </w:tblCellMar>
-        <w:tblLook w:val="04A0" w:firstRow="1" w:lastRow="0" w:firstColumn="1" w:lastColumn="0" w:noHBand="0" w:noVBand="1"/>
+        <w:tblLook w:val="0000" w:firstRow="0" w:lastRow="0" w:firstColumn="0" w:lastColumn="0" w:noHBand="0" w:noVBand="0"/>
       </w:tblPr>
       <w:tblGrid>
         <w:gridCol w:w="2400"/>
         <w:gridCol w:w="6960"/>
       </w:tblGrid>
       <w:tr>
-        <w:tblPrEx>
-          <w:tblCellMar>
-            <w:top w:w="0" w:type="dxa"/>
-            <w:bottom w:w="0" w:type="dxa"/>
-          </w:tblCellMar>
-        </w:tblPrEx>
         <w:tc>
           <w:tcPr>
             <w:tcW w:w="9360" w:type="dxa"/>
@@ -3945,12 +4082,6 @@
         </w:tc>
       </w:tr>
       <w:tr>
-        <w:tblPrEx>
-          <w:tblCellMar>
-            <w:top w:w="0" w:type="dxa"/>
-            <w:bottom w:w="0" w:type="dxa"/>
-          </w:tblCellMar>
-        </w:tblPrEx>
         <w:tc>
           <w:tcPr>
             <w:tcW w:w="2400" w:type="dxa"/>
@@ -4018,12 +4149,6 @@
         </w:tc>
       </w:tr>
       <w:tr>
-        <w:tblPrEx>
-          <w:tblCellMar>
-            <w:top w:w="0" w:type="dxa"/>
-            <w:bottom w:w="0" w:type="dxa"/>
-          </w:tblCellMar>
-        </w:tblPrEx>
         <w:tc>
           <w:tcPr>
             <w:tcW w:w="2400" w:type="dxa"/>
@@ -4193,12 +4318,6 @@
         </w:tc>
       </w:tr>
       <w:tr>
-        <w:tblPrEx>
-          <w:tblCellMar>
-            <w:top w:w="0" w:type="dxa"/>
-            <w:bottom w:w="0" w:type="dxa"/>
-          </w:tblCellMar>
-        </w:tblPrEx>
         <w:tc>
           <w:tcPr>
             <w:tcW w:w="2400" w:type="dxa"/>
@@ -4289,12 +4408,6 @@
         </w:tc>
       </w:tr>
       <w:tr>
-        <w:tblPrEx>
-          <w:tblCellMar>
-            <w:top w:w="0" w:type="dxa"/>
-            <w:bottom w:w="0" w:type="dxa"/>
-          </w:tblCellMar>
-        </w:tblPrEx>
         <w:tc>
           <w:tcPr>
             <w:tcW w:w="2400" w:type="dxa"/>
@@ -4385,19 +4498,13 @@
           <w:left w:w="10" w:type="dxa"/>
           <w:right w:w="10" w:type="dxa"/>
         </w:tblCellMar>
-        <w:tblLook w:val="04A0" w:firstRow="1" w:lastRow="0" w:firstColumn="1" w:lastColumn="0" w:noHBand="0" w:noVBand="1"/>
+        <w:tblLook w:val="0000" w:firstRow="0" w:lastRow="0" w:firstColumn="0" w:lastColumn="0" w:noHBand="0" w:noVBand="0"/>
       </w:tblPr>
       <w:tblGrid>
         <w:gridCol w:w="2400"/>
         <w:gridCol w:w="6960"/>
       </w:tblGrid>
       <w:tr>
-        <w:tblPrEx>
-          <w:tblCellMar>
-            <w:top w:w="0" w:type="dxa"/>
-            <w:bottom w:w="0" w:type="dxa"/>
-          </w:tblCellMar>
-        </w:tblPrEx>
         <w:tc>
           <w:tcPr>
             <w:tcW w:w="9360" w:type="dxa"/>
@@ -4455,12 +4562,6 @@
         </w:tc>
       </w:tr>
       <w:tr>
-        <w:tblPrEx>
-          <w:tblCellMar>
-            <w:top w:w="0" w:type="dxa"/>
-            <w:bottom w:w="0" w:type="dxa"/>
-          </w:tblCellMar>
-        </w:tblPrEx>
         <w:tc>
           <w:tcPr>
             <w:tcW w:w="2400" w:type="dxa"/>
@@ -4546,12 +4647,6 @@
         </w:tc>
       </w:tr>
       <w:tr>
-        <w:tblPrEx>
-          <w:tblCellMar>
-            <w:top w:w="0" w:type="dxa"/>
-            <w:bottom w:w="0" w:type="dxa"/>
-          </w:tblCellMar>
-        </w:tblPrEx>
         <w:tc>
           <w:tcPr>
             <w:tcW w:w="2400" w:type="dxa"/>
@@ -4657,12 +4752,6 @@
         </w:tc>
       </w:tr>
       <w:tr>
-        <w:tblPrEx>
-          <w:tblCellMar>
-            <w:top w:w="0" w:type="dxa"/>
-            <w:bottom w:w="0" w:type="dxa"/>
-          </w:tblCellMar>
-        </w:tblPrEx>
         <w:tc>
           <w:tcPr>
             <w:tcW w:w="2400" w:type="dxa"/>
@@ -4753,12 +4842,6 @@
         </w:tc>
       </w:tr>
       <w:tr>
-        <w:tblPrEx>
-          <w:tblCellMar>
-            <w:top w:w="0" w:type="dxa"/>
-            <w:bottom w:w="0" w:type="dxa"/>
-          </w:tblCellMar>
-        </w:tblPrEx>
         <w:tc>
           <w:tcPr>
             <w:tcW w:w="2400" w:type="dxa"/>
@@ -4849,19 +4932,13 @@
           <w:left w:w="10" w:type="dxa"/>
           <w:right w:w="10" w:type="dxa"/>
         </w:tblCellMar>
-        <w:tblLook w:val="04A0" w:firstRow="1" w:lastRow="0" w:firstColumn="1" w:lastColumn="0" w:noHBand="0" w:noVBand="1"/>
+        <w:tblLook w:val="0000" w:firstRow="0" w:lastRow="0" w:firstColumn="0" w:lastColumn="0" w:noHBand="0" w:noVBand="0"/>
       </w:tblPr>
       <w:tblGrid>
         <w:gridCol w:w="2400"/>
         <w:gridCol w:w="6960"/>
       </w:tblGrid>
       <w:tr>
-        <w:tblPrEx>
-          <w:tblCellMar>
-            <w:top w:w="0" w:type="dxa"/>
-            <w:bottom w:w="0" w:type="dxa"/>
-          </w:tblCellMar>
-        </w:tblPrEx>
         <w:tc>
           <w:tcPr>
             <w:tcW w:w="9360" w:type="dxa"/>
@@ -4919,12 +4996,6 @@
         </w:tc>
       </w:tr>
       <w:tr>
-        <w:tblPrEx>
-          <w:tblCellMar>
-            <w:top w:w="0" w:type="dxa"/>
-            <w:bottom w:w="0" w:type="dxa"/>
-          </w:tblCellMar>
-        </w:tblPrEx>
         <w:tc>
           <w:tcPr>
             <w:tcW w:w="2400" w:type="dxa"/>
@@ -5028,12 +5099,6 @@
         </w:tc>
       </w:tr>
       <w:tr>
-        <w:tblPrEx>
-          <w:tblCellMar>
-            <w:top w:w="0" w:type="dxa"/>
-            <w:bottom w:w="0" w:type="dxa"/>
-          </w:tblCellMar>
-        </w:tblPrEx>
         <w:tc>
           <w:tcPr>
             <w:tcW w:w="2400" w:type="dxa"/>
@@ -5121,12 +5186,6 @@
         </w:tc>
       </w:tr>
       <w:tr>
-        <w:tblPrEx>
-          <w:tblCellMar>
-            <w:top w:w="0" w:type="dxa"/>
-            <w:bottom w:w="0" w:type="dxa"/>
-          </w:tblCellMar>
-        </w:tblPrEx>
         <w:tc>
           <w:tcPr>
             <w:tcW w:w="2400" w:type="dxa"/>
@@ -5217,12 +5276,6 @@
         </w:tc>
       </w:tr>
       <w:tr>
-        <w:tblPrEx>
-          <w:tblCellMar>
-            <w:top w:w="0" w:type="dxa"/>
-            <w:bottom w:w="0" w:type="dxa"/>
-          </w:tblCellMar>
-        </w:tblPrEx>
         <w:tc>
           <w:tcPr>
             <w:tcW w:w="2400" w:type="dxa"/>
@@ -5313,19 +5366,13 @@
           <w:left w:w="10" w:type="dxa"/>
           <w:right w:w="10" w:type="dxa"/>
         </w:tblCellMar>
-        <w:tblLook w:val="04A0" w:firstRow="1" w:lastRow="0" w:firstColumn="1" w:lastColumn="0" w:noHBand="0" w:noVBand="1"/>
+        <w:tblLook w:val="0000" w:firstRow="0" w:lastRow="0" w:firstColumn="0" w:lastColumn="0" w:noHBand="0" w:noVBand="0"/>
       </w:tblPr>
       <w:tblGrid>
         <w:gridCol w:w="2400"/>
         <w:gridCol w:w="6960"/>
       </w:tblGrid>
       <w:tr>
-        <w:tblPrEx>
-          <w:tblCellMar>
-            <w:top w:w="0" w:type="dxa"/>
-            <w:bottom w:w="0" w:type="dxa"/>
-          </w:tblCellMar>
-        </w:tblPrEx>
         <w:tc>
           <w:tcPr>
             <w:tcW w:w="9360" w:type="dxa"/>
@@ -5383,12 +5430,6 @@
         </w:tc>
       </w:tr>
       <w:tr>
-        <w:tblPrEx>
-          <w:tblCellMar>
-            <w:top w:w="0" w:type="dxa"/>
-            <w:bottom w:w="0" w:type="dxa"/>
-          </w:tblCellMar>
-        </w:tblPrEx>
         <w:tc>
           <w:tcPr>
             <w:tcW w:w="2400" w:type="dxa"/>
@@ -5474,12 +5515,6 @@
         </w:tc>
       </w:tr>
       <w:tr>
-        <w:tblPrEx>
-          <w:tblCellMar>
-            <w:top w:w="0" w:type="dxa"/>
-            <w:bottom w:w="0" w:type="dxa"/>
-          </w:tblCellMar>
-        </w:tblPrEx>
         <w:tc>
           <w:tcPr>
             <w:tcW w:w="2400" w:type="dxa"/>
@@ -5585,12 +5620,6 @@
         </w:tc>
       </w:tr>
       <w:tr>
-        <w:tblPrEx>
-          <w:tblCellMar>
-            <w:top w:w="0" w:type="dxa"/>
-            <w:bottom w:w="0" w:type="dxa"/>
-          </w:tblCellMar>
-        </w:tblPrEx>
         <w:tc>
           <w:tcPr>
             <w:tcW w:w="2400" w:type="dxa"/>
@@ -5682,12 +5711,6 @@
         </w:tc>
       </w:tr>
       <w:tr>
-        <w:tblPrEx>
-          <w:tblCellMar>
-            <w:top w:w="0" w:type="dxa"/>
-            <w:bottom w:w="0" w:type="dxa"/>
-          </w:tblCellMar>
-        </w:tblPrEx>
         <w:tc>
           <w:tcPr>
             <w:tcW w:w="2400" w:type="dxa"/>
@@ -5778,19 +5801,13 @@
           <w:left w:w="10" w:type="dxa"/>
           <w:right w:w="10" w:type="dxa"/>
         </w:tblCellMar>
-        <w:tblLook w:val="04A0" w:firstRow="1" w:lastRow="0" w:firstColumn="1" w:lastColumn="0" w:noHBand="0" w:noVBand="1"/>
+        <w:tblLook w:val="0000" w:firstRow="0" w:lastRow="0" w:firstColumn="0" w:lastColumn="0" w:noHBand="0" w:noVBand="0"/>
       </w:tblPr>
       <w:tblGrid>
         <w:gridCol w:w="2400"/>
         <w:gridCol w:w="6960"/>
       </w:tblGrid>
       <w:tr>
-        <w:tblPrEx>
-          <w:tblCellMar>
-            <w:top w:w="0" w:type="dxa"/>
-            <w:bottom w:w="0" w:type="dxa"/>
-          </w:tblCellMar>
-        </w:tblPrEx>
         <w:tc>
           <w:tcPr>
             <w:tcW w:w="9360" w:type="dxa"/>
@@ -5848,12 +5865,6 @@
         </w:tc>
       </w:tr>
       <w:tr>
-        <w:tblPrEx>
-          <w:tblCellMar>
-            <w:top w:w="0" w:type="dxa"/>
-            <w:bottom w:w="0" w:type="dxa"/>
-          </w:tblCellMar>
-        </w:tblPrEx>
         <w:tc>
           <w:tcPr>
             <w:tcW w:w="2400" w:type="dxa"/>
@@ -5957,12 +5968,6 @@
         </w:tc>
       </w:tr>
       <w:tr>
-        <w:tblPrEx>
-          <w:tblCellMar>
-            <w:top w:w="0" w:type="dxa"/>
-            <w:bottom w:w="0" w:type="dxa"/>
-          </w:tblCellMar>
-        </w:tblPrEx>
         <w:tc>
           <w:tcPr>
             <w:tcW w:w="2400" w:type="dxa"/>
@@ -6086,12 +6091,6 @@
         </w:tc>
       </w:tr>
       <w:tr>
-        <w:tblPrEx>
-          <w:tblCellMar>
-            <w:top w:w="0" w:type="dxa"/>
-            <w:bottom w:w="0" w:type="dxa"/>
-          </w:tblCellMar>
-        </w:tblPrEx>
         <w:tc>
           <w:tcPr>
             <w:tcW w:w="2400" w:type="dxa"/>
@@ -6182,12 +6181,6 @@
         </w:tc>
       </w:tr>
       <w:tr>
-        <w:tblPrEx>
-          <w:tblCellMar>
-            <w:top w:w="0" w:type="dxa"/>
-            <w:bottom w:w="0" w:type="dxa"/>
-          </w:tblCellMar>
-        </w:tblPrEx>
         <w:tc>
           <w:tcPr>
             <w:tcW w:w="2400" w:type="dxa"/>
@@ -6278,19 +6271,13 @@
           <w:left w:w="10" w:type="dxa"/>
           <w:right w:w="10" w:type="dxa"/>
         </w:tblCellMar>
-        <w:tblLook w:val="04A0" w:firstRow="1" w:lastRow="0" w:firstColumn="1" w:lastColumn="0" w:noHBand="0" w:noVBand="1"/>
+        <w:tblLook w:val="0000" w:firstRow="0" w:lastRow="0" w:firstColumn="0" w:lastColumn="0" w:noHBand="0" w:noVBand="0"/>
       </w:tblPr>
       <w:tblGrid>
         <w:gridCol w:w="2400"/>
         <w:gridCol w:w="6960"/>
       </w:tblGrid>
       <w:tr>
-        <w:tblPrEx>
-          <w:tblCellMar>
-            <w:top w:w="0" w:type="dxa"/>
-            <w:bottom w:w="0" w:type="dxa"/>
-          </w:tblCellMar>
-        </w:tblPrEx>
         <w:tc>
           <w:tcPr>
             <w:tcW w:w="9360" w:type="dxa"/>
@@ -6348,12 +6335,6 @@
         </w:tc>
       </w:tr>
       <w:tr>
-        <w:tblPrEx>
-          <w:tblCellMar>
-            <w:top w:w="0" w:type="dxa"/>
-            <w:bottom w:w="0" w:type="dxa"/>
-          </w:tblCellMar>
-        </w:tblPrEx>
         <w:tc>
           <w:tcPr>
             <w:tcW w:w="2400" w:type="dxa"/>
@@ -6457,12 +6438,6 @@
         </w:tc>
       </w:tr>
       <w:tr>
-        <w:tblPrEx>
-          <w:tblCellMar>
-            <w:top w:w="0" w:type="dxa"/>
-            <w:bottom w:w="0" w:type="dxa"/>
-          </w:tblCellMar>
-        </w:tblPrEx>
         <w:tc>
           <w:tcPr>
             <w:tcW w:w="2400" w:type="dxa"/>
@@ -6586,12 +6561,6 @@
         </w:tc>
       </w:tr>
       <w:tr>
-        <w:tblPrEx>
-          <w:tblCellMar>
-            <w:top w:w="0" w:type="dxa"/>
-            <w:bottom w:w="0" w:type="dxa"/>
-          </w:tblCellMar>
-        </w:tblPrEx>
         <w:tc>
           <w:tcPr>
             <w:tcW w:w="2400" w:type="dxa"/>
@@ -6682,12 +6651,6 @@
         </w:tc>
       </w:tr>
       <w:tr>
-        <w:tblPrEx>
-          <w:tblCellMar>
-            <w:top w:w="0" w:type="dxa"/>
-            <w:bottom w:w="0" w:type="dxa"/>
-          </w:tblCellMar>
-        </w:tblPrEx>
         <w:tc>
           <w:tcPr>
             <w:tcW w:w="2400" w:type="dxa"/>
@@ -6778,19 +6741,13 @@
           <w:left w:w="10" w:type="dxa"/>
           <w:right w:w="10" w:type="dxa"/>
         </w:tblCellMar>
-        <w:tblLook w:val="04A0" w:firstRow="1" w:lastRow="0" w:firstColumn="1" w:lastColumn="0" w:noHBand="0" w:noVBand="1"/>
+        <w:tblLook w:val="0000" w:firstRow="0" w:lastRow="0" w:firstColumn="0" w:lastColumn="0" w:noHBand="0" w:noVBand="0"/>
       </w:tblPr>
       <w:tblGrid>
         <w:gridCol w:w="2400"/>
         <w:gridCol w:w="6960"/>
       </w:tblGrid>
       <w:tr>
-        <w:tblPrEx>
-          <w:tblCellMar>
-            <w:top w:w="0" w:type="dxa"/>
-            <w:bottom w:w="0" w:type="dxa"/>
-          </w:tblCellMar>
-        </w:tblPrEx>
         <w:tc>
           <w:tcPr>
             <w:tcW w:w="9360" w:type="dxa"/>
@@ -6822,7 +6779,7 @@
                 <w:color w:val="FFFFFF"/>
                 <w:lang w:val="es-CO"/>
               </w:rPr>
-              <w:t>RF-</w:t>
+              <w:t>[SUSPENDIDO] RF-</w:t>
             </w:r>
             <w:proofErr w:type="gramStart"/>
             <w:r>
@@ -6888,12 +6845,6 @@
         </w:tc>
       </w:tr>
       <w:tr>
-        <w:tblPrEx>
-          <w:tblCellMar>
-            <w:top w:w="0" w:type="dxa"/>
-            <w:bottom w:w="0" w:type="dxa"/>
-          </w:tblCellMar>
-        </w:tblPrEx>
         <w:tc>
           <w:tcPr>
             <w:tcW w:w="2400" w:type="dxa"/>
@@ -6979,12 +6930,6 @@
         </w:tc>
       </w:tr>
       <w:tr>
-        <w:tblPrEx>
-          <w:tblCellMar>
-            <w:top w:w="0" w:type="dxa"/>
-            <w:bottom w:w="0" w:type="dxa"/>
-          </w:tblCellMar>
-        </w:tblPrEx>
         <w:tc>
           <w:tcPr>
             <w:tcW w:w="2400" w:type="dxa"/>
@@ -7072,12 +7017,6 @@
         </w:tc>
       </w:tr>
       <w:tr>
-        <w:tblPrEx>
-          <w:tblCellMar>
-            <w:top w:w="0" w:type="dxa"/>
-            <w:bottom w:w="0" w:type="dxa"/>
-          </w:tblCellMar>
-        </w:tblPrEx>
         <w:tc>
           <w:tcPr>
             <w:tcW w:w="2400" w:type="dxa"/>
@@ -7168,12 +7107,6 @@
         </w:tc>
       </w:tr>
       <w:tr>
-        <w:tblPrEx>
-          <w:tblCellMar>
-            <w:top w:w="0" w:type="dxa"/>
-            <w:bottom w:w="0" w:type="dxa"/>
-          </w:tblCellMar>
-        </w:tblPrEx>
         <w:tc>
           <w:tcPr>
             <w:tcW w:w="2400" w:type="dxa"/>
@@ -7264,19 +7197,13 @@
           <w:left w:w="10" w:type="dxa"/>
           <w:right w:w="10" w:type="dxa"/>
         </w:tblCellMar>
-        <w:tblLook w:val="04A0" w:firstRow="1" w:lastRow="0" w:firstColumn="1" w:lastColumn="0" w:noHBand="0" w:noVBand="1"/>
+        <w:tblLook w:val="0000" w:firstRow="0" w:lastRow="0" w:firstColumn="0" w:lastColumn="0" w:noHBand="0" w:noVBand="0"/>
       </w:tblPr>
       <w:tblGrid>
         <w:gridCol w:w="2400"/>
         <w:gridCol w:w="6960"/>
       </w:tblGrid>
       <w:tr>
-        <w:tblPrEx>
-          <w:tblCellMar>
-            <w:top w:w="0" w:type="dxa"/>
-            <w:bottom w:w="0" w:type="dxa"/>
-          </w:tblCellMar>
-        </w:tblPrEx>
         <w:tc>
           <w:tcPr>
             <w:tcW w:w="9360" w:type="dxa"/>
@@ -7354,12 +7281,6 @@
         </w:tc>
       </w:tr>
       <w:tr>
-        <w:tblPrEx>
-          <w:tblCellMar>
-            <w:top w:w="0" w:type="dxa"/>
-            <w:bottom w:w="0" w:type="dxa"/>
-          </w:tblCellMar>
-        </w:tblPrEx>
         <w:tc>
           <w:tcPr>
             <w:tcW w:w="2400" w:type="dxa"/>
@@ -7463,12 +7384,6 @@
         </w:tc>
       </w:tr>
       <w:tr>
-        <w:tblPrEx>
-          <w:tblCellMar>
-            <w:top w:w="0" w:type="dxa"/>
-            <w:bottom w:w="0" w:type="dxa"/>
-          </w:tblCellMar>
-        </w:tblPrEx>
         <w:tc>
           <w:tcPr>
             <w:tcW w:w="2400" w:type="dxa"/>
@@ -7556,12 +7471,6 @@
         </w:tc>
       </w:tr>
       <w:tr>
-        <w:tblPrEx>
-          <w:tblCellMar>
-            <w:top w:w="0" w:type="dxa"/>
-            <w:bottom w:w="0" w:type="dxa"/>
-          </w:tblCellMar>
-        </w:tblPrEx>
         <w:tc>
           <w:tcPr>
             <w:tcW w:w="2400" w:type="dxa"/>
@@ -7653,12 +7562,6 @@
         </w:tc>
       </w:tr>
       <w:tr>
-        <w:tblPrEx>
-          <w:tblCellMar>
-            <w:top w:w="0" w:type="dxa"/>
-            <w:bottom w:w="0" w:type="dxa"/>
-          </w:tblCellMar>
-        </w:tblPrEx>
         <w:tc>
           <w:tcPr>
             <w:tcW w:w="2400" w:type="dxa"/>
@@ -7749,19 +7652,13 @@
           <w:left w:w="10" w:type="dxa"/>
           <w:right w:w="10" w:type="dxa"/>
         </w:tblCellMar>
-        <w:tblLook w:val="04A0" w:firstRow="1" w:lastRow="0" w:firstColumn="1" w:lastColumn="0" w:noHBand="0" w:noVBand="1"/>
+        <w:tblLook w:val="0000" w:firstRow="0" w:lastRow="0" w:firstColumn="0" w:lastColumn="0" w:noHBand="0" w:noVBand="0"/>
       </w:tblPr>
       <w:tblGrid>
         <w:gridCol w:w="2400"/>
         <w:gridCol w:w="6960"/>
       </w:tblGrid>
       <w:tr>
-        <w:tblPrEx>
-          <w:tblCellMar>
-            <w:top w:w="0" w:type="dxa"/>
-            <w:bottom w:w="0" w:type="dxa"/>
-          </w:tblCellMar>
-        </w:tblPrEx>
         <w:tc>
           <w:tcPr>
             <w:tcW w:w="9360" w:type="dxa"/>
@@ -7819,12 +7716,6 @@
         </w:tc>
       </w:tr>
       <w:tr>
-        <w:tblPrEx>
-          <w:tblCellMar>
-            <w:top w:w="0" w:type="dxa"/>
-            <w:bottom w:w="0" w:type="dxa"/>
-          </w:tblCellMar>
-        </w:tblPrEx>
         <w:tc>
           <w:tcPr>
             <w:tcW w:w="2400" w:type="dxa"/>
@@ -7886,36 +7777,66 @@
                 <w:szCs w:val="20"/>
                 <w:lang w:val="es-CO"/>
               </w:rPr>
-              <w:t xml:space="preserve">El sistema debe exponer una interfaz que permita: (a) iniciar STORE/RETRIEVE/SWAP indicando celda, (b) visualizar el mapa de inventario actual, (c) visualizar el log de eventos, (d) configurar parámetros (offset de </w:t>
-            </w:r>
-            <w:proofErr w:type="spellStart"/>
-            <w:r>
-              <w:rPr>
-                <w:sz w:val="20"/>
-                <w:szCs w:val="20"/>
-                <w:lang w:val="es-CO"/>
-              </w:rPr>
-              <w:t>homing</w:t>
-            </w:r>
-            <w:proofErr w:type="spellEnd"/>
-            <w:r>
-              <w:rPr>
-                <w:sz w:val="20"/>
-                <w:szCs w:val="20"/>
-                <w:lang w:val="es-CO"/>
-              </w:rPr>
-              <w:t>, peso mínimo válido).</w:t>
+              <w:t xml:space="preserve">El sistema debe exponer una aplicación de escritorio (Python 3 + </w:t>
+            </w:r>
+            <w:proofErr w:type="spellStart"/>
+            <w:r>
+              <w:rPr>
+                <w:sz w:val="20"/>
+                <w:szCs w:val="20"/>
+                <w:lang w:val="es-CO"/>
+              </w:rPr>
+              <w:t>tkinter</w:t>
+            </w:r>
+            <w:proofErr w:type="spellEnd"/>
+            <w:r>
+              <w:rPr>
+                <w:sz w:val="20"/>
+                <w:szCs w:val="20"/>
+                <w:lang w:val="es-CO"/>
+              </w:rPr>
+              <w:t xml:space="preserve">) que se comunique con el ESP32 a través del puerto serial USB-Serial (UART 115200 bps, 8N1) y permita: (a) enviar comandos </w:t>
+            </w:r>
+            <w:proofErr w:type="spellStart"/>
+            <w:r>
+              <w:rPr>
+                <w:sz w:val="20"/>
+                <w:szCs w:val="20"/>
+                <w:lang w:val="es-CO"/>
+              </w:rPr>
+              <w:t>STORE:celda</w:t>
+            </w:r>
+            <w:proofErr w:type="spellEnd"/>
+            <w:r>
+              <w:rPr>
+                <w:sz w:val="20"/>
+                <w:szCs w:val="20"/>
+                <w:lang w:val="es-CO"/>
+              </w:rPr>
+              <w:t xml:space="preserve">, </w:t>
+            </w:r>
+            <w:proofErr w:type="spellStart"/>
+            <w:r>
+              <w:rPr>
+                <w:sz w:val="20"/>
+                <w:szCs w:val="20"/>
+                <w:lang w:val="es-CO"/>
+              </w:rPr>
+              <w:t>RETRIEVE:celda</w:t>
+            </w:r>
+            <w:proofErr w:type="spellEnd"/>
+            <w:r>
+              <w:rPr>
+                <w:sz w:val="20"/>
+                <w:szCs w:val="20"/>
+                <w:lang w:val="es-CO"/>
+              </w:rPr>
+              <w:t xml:space="preserve"> y SWAP:celda1:celda2 al sistema; (b) visualizar el mapa de inventario actual en una cuadrícula 3×4 con estado de cada celda (vacía / ocupada / peso); (c) visualizar el log de eventos en tiempo real con niveles INFO, WARN y ERROR; (d) mostrar el estado del sistema (IDLE, OPERANDO, FAULT, DEGRADED, E-STOP).</w:t>
             </w:r>
           </w:p>
         </w:tc>
       </w:tr>
       <w:tr>
-        <w:tblPrEx>
-          <w:tblCellMar>
-            <w:top w:w="0" w:type="dxa"/>
-            <w:bottom w:w="0" w:type="dxa"/>
-          </w:tblCellMar>
-        </w:tblPrEx>
         <w:tc>
           <w:tcPr>
             <w:tcW w:w="2400" w:type="dxa"/>
@@ -8003,12 +7924,6 @@
         </w:tc>
       </w:tr>
       <w:tr>
-        <w:tblPrEx>
-          <w:tblCellMar>
-            <w:top w:w="0" w:type="dxa"/>
-            <w:bottom w:w="0" w:type="dxa"/>
-          </w:tblCellMar>
-        </w:tblPrEx>
         <w:tc>
           <w:tcPr>
             <w:tcW w:w="2400" w:type="dxa"/>
@@ -8099,12 +8014,6 @@
         </w:tc>
       </w:tr>
       <w:tr>
-        <w:tblPrEx>
-          <w:tblCellMar>
-            <w:top w:w="0" w:type="dxa"/>
-            <w:bottom w:w="0" w:type="dxa"/>
-          </w:tblCellMar>
-        </w:tblPrEx>
         <w:tc>
           <w:tcPr>
             <w:tcW w:w="2400" w:type="dxa"/>
@@ -8238,19 +8147,13 @@
           <w:left w:w="10" w:type="dxa"/>
           <w:right w:w="10" w:type="dxa"/>
         </w:tblCellMar>
-        <w:tblLook w:val="04A0" w:firstRow="1" w:lastRow="0" w:firstColumn="1" w:lastColumn="0" w:noHBand="0" w:noVBand="1"/>
+        <w:tblLook w:val="0000" w:firstRow="0" w:lastRow="0" w:firstColumn="0" w:lastColumn="0" w:noHBand="0" w:noVBand="0"/>
       </w:tblPr>
       <w:tblGrid>
         <w:gridCol w:w="2400"/>
         <w:gridCol w:w="6960"/>
       </w:tblGrid>
       <w:tr>
-        <w:tblPrEx>
-          <w:tblCellMar>
-            <w:top w:w="0" w:type="dxa"/>
-            <w:bottom w:w="0" w:type="dxa"/>
-          </w:tblCellMar>
-        </w:tblPrEx>
         <w:tc>
           <w:tcPr>
             <w:tcW w:w="9360" w:type="dxa"/>
@@ -8308,12 +8211,6 @@
         </w:tc>
       </w:tr>
       <w:tr>
-        <w:tblPrEx>
-          <w:tblCellMar>
-            <w:top w:w="0" w:type="dxa"/>
-            <w:bottom w:w="0" w:type="dxa"/>
-          </w:tblCellMar>
-        </w:tblPrEx>
         <w:tc>
           <w:tcPr>
             <w:tcW w:w="2400" w:type="dxa"/>
@@ -8381,12 +8278,6 @@
         </w:tc>
       </w:tr>
       <w:tr>
-        <w:tblPrEx>
-          <w:tblCellMar>
-            <w:top w:w="0" w:type="dxa"/>
-            <w:bottom w:w="0" w:type="dxa"/>
-          </w:tblCellMar>
-        </w:tblPrEx>
         <w:tc>
           <w:tcPr>
             <w:tcW w:w="2400" w:type="dxa"/>
@@ -8535,12 +8426,6 @@
         </w:tc>
       </w:tr>
       <w:tr>
-        <w:tblPrEx>
-          <w:tblCellMar>
-            <w:top w:w="0" w:type="dxa"/>
-            <w:bottom w:w="0" w:type="dxa"/>
-          </w:tblCellMar>
-        </w:tblPrEx>
         <w:tc>
           <w:tcPr>
             <w:tcW w:w="2400" w:type="dxa"/>
@@ -8631,12 +8516,6 @@
         </w:tc>
       </w:tr>
       <w:tr>
-        <w:tblPrEx>
-          <w:tblCellMar>
-            <w:top w:w="0" w:type="dxa"/>
-            <w:bottom w:w="0" w:type="dxa"/>
-          </w:tblCellMar>
-        </w:tblPrEx>
         <w:tc>
           <w:tcPr>
             <w:tcW w:w="2400" w:type="dxa"/>
@@ -8727,19 +8606,13 @@
           <w:left w:w="10" w:type="dxa"/>
           <w:right w:w="10" w:type="dxa"/>
         </w:tblCellMar>
-        <w:tblLook w:val="04A0" w:firstRow="1" w:lastRow="0" w:firstColumn="1" w:lastColumn="0" w:noHBand="0" w:noVBand="1"/>
+        <w:tblLook w:val="0000" w:firstRow="0" w:lastRow="0" w:firstColumn="0" w:lastColumn="0" w:noHBand="0" w:noVBand="0"/>
       </w:tblPr>
       <w:tblGrid>
         <w:gridCol w:w="2400"/>
         <w:gridCol w:w="6960"/>
       </w:tblGrid>
       <w:tr>
-        <w:tblPrEx>
-          <w:tblCellMar>
-            <w:top w:w="0" w:type="dxa"/>
-            <w:bottom w:w="0" w:type="dxa"/>
-          </w:tblCellMar>
-        </w:tblPrEx>
         <w:tc>
           <w:tcPr>
             <w:tcW w:w="9360" w:type="dxa"/>
@@ -8809,12 +8682,6 @@
         </w:tc>
       </w:tr>
       <w:tr>
-        <w:tblPrEx>
-          <w:tblCellMar>
-            <w:top w:w="0" w:type="dxa"/>
-            <w:bottom w:w="0" w:type="dxa"/>
-          </w:tblCellMar>
-        </w:tblPrEx>
         <w:tc>
           <w:tcPr>
             <w:tcW w:w="2400" w:type="dxa"/>
@@ -8900,12 +8767,6 @@
         </w:tc>
       </w:tr>
       <w:tr>
-        <w:tblPrEx>
-          <w:tblCellMar>
-            <w:top w:w="0" w:type="dxa"/>
-            <w:bottom w:w="0" w:type="dxa"/>
-          </w:tblCellMar>
-        </w:tblPrEx>
         <w:tc>
           <w:tcPr>
             <w:tcW w:w="2400" w:type="dxa"/>
@@ -8976,18 +8837,13 @@
             <w:vAlign w:val="center"/>
           </w:tcPr>
           <w:p>
-            <w:pPr>
-              <w:rPr>
-                <w:lang w:val="es-CO"/>
-              </w:rPr>
-            </w:pPr>
-            <w:r>
-              <w:rPr>
-                <w:sz w:val="20"/>
-                <w:szCs w:val="20"/>
-                <w:lang w:val="es-CO"/>
-              </w:rPr>
-              <w:t xml:space="preserve">El sistema opera ≥ 30 minutos en demo continua sin caída de tensión &gt; 5% en el riel de 5 V medido bajo carga máxima (3 </w:t>
+            <w:r>
+              <w:rPr>
+                <w:sz w:val="20"/>
+                <w:szCs w:val="20"/>
+                <w:lang w:val="es-CO"/>
+              </w:rPr>
+              <w:t xml:space="preserve">La fuente externa debe mantener el riel de 5V con caída de tensión ≤ 5% bajo carga máxima sostenida. Verificable midiendo con multímetro el riel de 5V con los 2 </w:t>
             </w:r>
             <w:proofErr w:type="spellStart"/>
             <w:r>
@@ -9005,18 +8861,99 @@
                 <w:szCs w:val="20"/>
                 <w:lang w:val="es-CO"/>
               </w:rPr>
-              <w:t xml:space="preserve"> activos simultáneamente).</w:t>
+              <w:t xml:space="preserve"> activos simultáneamente y el servo en posición de carga. </w:t>
+            </w:r>
+            <w:r>
+              <w:rPr>
+                <w:sz w:val="20"/>
+                <w:szCs w:val="20"/>
+              </w:rPr>
+              <w:t xml:space="preserve">La </w:t>
+            </w:r>
+            <w:proofErr w:type="spellStart"/>
+            <w:r>
+              <w:rPr>
+                <w:sz w:val="20"/>
+                <w:szCs w:val="20"/>
+              </w:rPr>
+              <w:t>medición</w:t>
+            </w:r>
+            <w:proofErr w:type="spellEnd"/>
+            <w:r>
+              <w:rPr>
+                <w:sz w:val="20"/>
+                <w:szCs w:val="20"/>
+              </w:rPr>
+              <w:t xml:space="preserve"> se </w:t>
+            </w:r>
+            <w:proofErr w:type="spellStart"/>
+            <w:r>
+              <w:rPr>
+                <w:sz w:val="20"/>
+                <w:szCs w:val="20"/>
+              </w:rPr>
+              <w:t>realiza</w:t>
+            </w:r>
+            <w:proofErr w:type="spellEnd"/>
+            <w:r>
+              <w:rPr>
+                <w:sz w:val="20"/>
+                <w:szCs w:val="20"/>
+              </w:rPr>
+              <w:t xml:space="preserve"> </w:t>
+            </w:r>
+            <w:proofErr w:type="spellStart"/>
+            <w:r>
+              <w:rPr>
+                <w:sz w:val="20"/>
+                <w:szCs w:val="20"/>
+              </w:rPr>
+              <w:t>durante</w:t>
+            </w:r>
+            <w:proofErr w:type="spellEnd"/>
+            <w:r>
+              <w:rPr>
+                <w:sz w:val="20"/>
+                <w:szCs w:val="20"/>
+              </w:rPr>
+              <w:t xml:space="preserve"> al </w:t>
+            </w:r>
+            <w:proofErr w:type="spellStart"/>
+            <w:r>
+              <w:rPr>
+                <w:sz w:val="20"/>
+                <w:szCs w:val="20"/>
+              </w:rPr>
+              <w:t>menos</w:t>
+            </w:r>
+            <w:proofErr w:type="spellEnd"/>
+            <w:r>
+              <w:rPr>
+                <w:sz w:val="20"/>
+                <w:szCs w:val="20"/>
+              </w:rPr>
+              <w:t xml:space="preserve"> 60 </w:t>
+            </w:r>
+            <w:proofErr w:type="spellStart"/>
+            <w:r>
+              <w:rPr>
+                <w:sz w:val="20"/>
+                <w:szCs w:val="20"/>
+              </w:rPr>
+              <w:t>segundos</w:t>
+            </w:r>
+            <w:proofErr w:type="spellEnd"/>
+            <w:r>
+              <w:rPr>
+                <w:sz w:val="20"/>
+                <w:szCs w:val="20"/>
+              </w:rPr>
+              <w:t>.</w:t>
             </w:r>
           </w:p>
         </w:tc>
       </w:tr>
       <w:tr>
-        <w:tblPrEx>
-          <w:tblCellMar>
-            <w:top w:w="0" w:type="dxa"/>
-            <w:bottom w:w="0" w:type="dxa"/>
-          </w:tblCellMar>
-        </w:tblPrEx>
         <w:tc>
           <w:tcPr>
             <w:tcW w:w="2400" w:type="dxa"/>
@@ -9107,12 +9044,6 @@
         </w:tc>
       </w:tr>
       <w:tr>
-        <w:tblPrEx>
-          <w:tblCellMar>
-            <w:top w:w="0" w:type="dxa"/>
-            <w:bottom w:w="0" w:type="dxa"/>
-          </w:tblCellMar>
-        </w:tblPrEx>
         <w:tc>
           <w:tcPr>
             <w:tcW w:w="2400" w:type="dxa"/>
@@ -9203,19 +9134,13 @@
           <w:left w:w="10" w:type="dxa"/>
           <w:right w:w="10" w:type="dxa"/>
         </w:tblCellMar>
-        <w:tblLook w:val="04A0" w:firstRow="1" w:lastRow="0" w:firstColumn="1" w:lastColumn="0" w:noHBand="0" w:noVBand="1"/>
+        <w:tblLook w:val="0000" w:firstRow="0" w:lastRow="0" w:firstColumn="0" w:lastColumn="0" w:noHBand="0" w:noVBand="0"/>
       </w:tblPr>
       <w:tblGrid>
         <w:gridCol w:w="2400"/>
         <w:gridCol w:w="6960"/>
       </w:tblGrid>
       <w:tr>
-        <w:tblPrEx>
-          <w:tblCellMar>
-            <w:top w:w="0" w:type="dxa"/>
-            <w:bottom w:w="0" w:type="dxa"/>
-          </w:tblCellMar>
-        </w:tblPrEx>
         <w:tc>
           <w:tcPr>
             <w:tcW w:w="9360" w:type="dxa"/>
@@ -9273,12 +9198,6 @@
         </w:tc>
       </w:tr>
       <w:tr>
-        <w:tblPrEx>
-          <w:tblCellMar>
-            <w:top w:w="0" w:type="dxa"/>
-            <w:bottom w:w="0" w:type="dxa"/>
-          </w:tblCellMar>
-        </w:tblPrEx>
         <w:tc>
           <w:tcPr>
             <w:tcW w:w="2400" w:type="dxa"/>
@@ -9364,12 +9283,6 @@
         </w:tc>
       </w:tr>
       <w:tr>
-        <w:tblPrEx>
-          <w:tblCellMar>
-            <w:top w:w="0" w:type="dxa"/>
-            <w:bottom w:w="0" w:type="dxa"/>
-          </w:tblCellMar>
-        </w:tblPrEx>
         <w:tc>
           <w:tcPr>
             <w:tcW w:w="2400" w:type="dxa"/>
@@ -9493,12 +9406,6 @@
         </w:tc>
       </w:tr>
       <w:tr>
-        <w:tblPrEx>
-          <w:tblCellMar>
-            <w:top w:w="0" w:type="dxa"/>
-            <w:bottom w:w="0" w:type="dxa"/>
-          </w:tblCellMar>
-        </w:tblPrEx>
         <w:tc>
           <w:tcPr>
             <w:tcW w:w="2400" w:type="dxa"/>
@@ -9589,12 +9496,6 @@
         </w:tc>
       </w:tr>
       <w:tr>
-        <w:tblPrEx>
-          <w:tblCellMar>
-            <w:top w:w="0" w:type="dxa"/>
-            <w:bottom w:w="0" w:type="dxa"/>
-          </w:tblCellMar>
-        </w:tblPrEx>
         <w:tc>
           <w:tcPr>
             <w:tcW w:w="2400" w:type="dxa"/>
@@ -9685,19 +9586,13 @@
           <w:left w:w="10" w:type="dxa"/>
           <w:right w:w="10" w:type="dxa"/>
         </w:tblCellMar>
-        <w:tblLook w:val="04A0" w:firstRow="1" w:lastRow="0" w:firstColumn="1" w:lastColumn="0" w:noHBand="0" w:noVBand="1"/>
+        <w:tblLook w:val="0000" w:firstRow="0" w:lastRow="0" w:firstColumn="0" w:lastColumn="0" w:noHBand="0" w:noVBand="0"/>
       </w:tblPr>
       <w:tblGrid>
         <w:gridCol w:w="2400"/>
         <w:gridCol w:w="6960"/>
       </w:tblGrid>
       <w:tr>
-        <w:tblPrEx>
-          <w:tblCellMar>
-            <w:top w:w="0" w:type="dxa"/>
-            <w:bottom w:w="0" w:type="dxa"/>
-          </w:tblCellMar>
-        </w:tblPrEx>
         <w:tc>
           <w:tcPr>
             <w:tcW w:w="9360" w:type="dxa"/>
@@ -9755,12 +9650,6 @@
         </w:tc>
       </w:tr>
       <w:tr>
-        <w:tblPrEx>
-          <w:tblCellMar>
-            <w:top w:w="0" w:type="dxa"/>
-            <w:bottom w:w="0" w:type="dxa"/>
-          </w:tblCellMar>
-        </w:tblPrEx>
         <w:tc>
           <w:tcPr>
             <w:tcW w:w="2400" w:type="dxa"/>
@@ -9828,12 +9717,6 @@
         </w:tc>
       </w:tr>
       <w:tr>
-        <w:tblPrEx>
-          <w:tblCellMar>
-            <w:top w:w="0" w:type="dxa"/>
-            <w:bottom w:w="0" w:type="dxa"/>
-          </w:tblCellMar>
-        </w:tblPrEx>
         <w:tc>
           <w:tcPr>
             <w:tcW w:w="2400" w:type="dxa"/>
@@ -9921,12 +9804,6 @@
         </w:tc>
       </w:tr>
       <w:tr>
-        <w:tblPrEx>
-          <w:tblCellMar>
-            <w:top w:w="0" w:type="dxa"/>
-            <w:bottom w:w="0" w:type="dxa"/>
-          </w:tblCellMar>
-        </w:tblPrEx>
         <w:tc>
           <w:tcPr>
             <w:tcW w:w="2400" w:type="dxa"/>
@@ -9954,6 +9831,7 @@
                 <w:sz w:val="20"/>
                 <w:szCs w:val="20"/>
               </w:rPr>
+              <w:lastRenderedPageBreak/>
               <w:t>Prioridad</w:t>
             </w:r>
             <w:proofErr w:type="spellEnd"/>
@@ -10017,12 +9895,6 @@
         </w:tc>
       </w:tr>
       <w:tr>
-        <w:tblPrEx>
-          <w:tblCellMar>
-            <w:top w:w="0" w:type="dxa"/>
-            <w:bottom w:w="0" w:type="dxa"/>
-          </w:tblCellMar>
-        </w:tblPrEx>
         <w:tc>
           <w:tcPr>
             <w:tcW w:w="2400" w:type="dxa"/>
@@ -10049,7 +9921,6 @@
                 <w:sz w:val="20"/>
                 <w:szCs w:val="20"/>
               </w:rPr>
-              <w:lastRenderedPageBreak/>
               <w:t xml:space="preserve">Test Case </w:t>
             </w:r>
             <w:proofErr w:type="spellStart"/>
@@ -10114,19 +9985,13 @@
           <w:left w:w="10" w:type="dxa"/>
           <w:right w:w="10" w:type="dxa"/>
         </w:tblCellMar>
-        <w:tblLook w:val="04A0" w:firstRow="1" w:lastRow="0" w:firstColumn="1" w:lastColumn="0" w:noHBand="0" w:noVBand="1"/>
+        <w:tblLook w:val="0000" w:firstRow="0" w:lastRow="0" w:firstColumn="0" w:lastColumn="0" w:noHBand="0" w:noVBand="0"/>
       </w:tblPr>
       <w:tblGrid>
         <w:gridCol w:w="2400"/>
         <w:gridCol w:w="6960"/>
       </w:tblGrid>
       <w:tr>
-        <w:tblPrEx>
-          <w:tblCellMar>
-            <w:top w:w="0" w:type="dxa"/>
-            <w:bottom w:w="0" w:type="dxa"/>
-          </w:tblCellMar>
-        </w:tblPrEx>
         <w:tc>
           <w:tcPr>
             <w:tcW w:w="9360" w:type="dxa"/>
@@ -10184,12 +10049,6 @@
         </w:tc>
       </w:tr>
       <w:tr>
-        <w:tblPrEx>
-          <w:tblCellMar>
-            <w:top w:w="0" w:type="dxa"/>
-            <w:bottom w:w="0" w:type="dxa"/>
-          </w:tblCellMar>
-        </w:tblPrEx>
         <w:tc>
           <w:tcPr>
             <w:tcW w:w="2400" w:type="dxa"/>
@@ -10293,12 +10152,6 @@
         </w:tc>
       </w:tr>
       <w:tr>
-        <w:tblPrEx>
-          <w:tblCellMar>
-            <w:top w:w="0" w:type="dxa"/>
-            <w:bottom w:w="0" w:type="dxa"/>
-          </w:tblCellMar>
-        </w:tblPrEx>
         <w:tc>
           <w:tcPr>
             <w:tcW w:w="2400" w:type="dxa"/>
@@ -10495,12 +10348,6 @@
         </w:tc>
       </w:tr>
       <w:tr>
-        <w:tblPrEx>
-          <w:tblCellMar>
-            <w:top w:w="0" w:type="dxa"/>
-            <w:bottom w:w="0" w:type="dxa"/>
-          </w:tblCellMar>
-        </w:tblPrEx>
         <w:tc>
           <w:tcPr>
             <w:tcW w:w="2400" w:type="dxa"/>
@@ -10591,12 +10438,6 @@
         </w:tc>
       </w:tr>
       <w:tr>
-        <w:tblPrEx>
-          <w:tblCellMar>
-            <w:top w:w="0" w:type="dxa"/>
-            <w:bottom w:w="0" w:type="dxa"/>
-          </w:tblCellMar>
-        </w:tblPrEx>
         <w:tc>
           <w:tcPr>
             <w:tcW w:w="2400" w:type="dxa"/>
@@ -10687,19 +10528,13 @@
           <w:left w:w="10" w:type="dxa"/>
           <w:right w:w="10" w:type="dxa"/>
         </w:tblCellMar>
-        <w:tblLook w:val="04A0" w:firstRow="1" w:lastRow="0" w:firstColumn="1" w:lastColumn="0" w:noHBand="0" w:noVBand="1"/>
+        <w:tblLook w:val="0000" w:firstRow="0" w:lastRow="0" w:firstColumn="0" w:lastColumn="0" w:noHBand="0" w:noVBand="0"/>
       </w:tblPr>
       <w:tblGrid>
         <w:gridCol w:w="2400"/>
         <w:gridCol w:w="6960"/>
       </w:tblGrid>
       <w:tr>
-        <w:tblPrEx>
-          <w:tblCellMar>
-            <w:top w:w="0" w:type="dxa"/>
-            <w:bottom w:w="0" w:type="dxa"/>
-          </w:tblCellMar>
-        </w:tblPrEx>
         <w:tc>
           <w:tcPr>
             <w:tcW w:w="9360" w:type="dxa"/>
@@ -10719,13 +10554,19 @@
             </w:tcMar>
           </w:tcPr>
           <w:p>
+            <w:pPr>
+              <w:rPr>
+                <w:lang w:val="es-CO"/>
+              </w:rPr>
+            </w:pPr>
             <w:r>
               <w:rPr>
                 <w:b/>
                 <w:bCs/>
                 <w:color w:val="FFFFFF"/>
-              </w:rPr>
-              <w:t>RNF-</w:t>
+                <w:lang w:val="es-CO"/>
+              </w:rPr>
+              <w:t>[SUSPENDIDO] RNF-</w:t>
             </w:r>
             <w:proofErr w:type="gramStart"/>
             <w:r>
@@ -10733,25 +10574,17 @@
                 <w:b/>
                 <w:bCs/>
                 <w:color w:val="FFFFFF"/>
-              </w:rPr>
-              <w:t xml:space="preserve">06  </w:t>
-            </w:r>
-            <w:proofErr w:type="spellStart"/>
+                <w:lang w:val="es-CO"/>
+              </w:rPr>
+              <w:t>06  Modularidad</w:t>
+            </w:r>
+            <w:proofErr w:type="gramEnd"/>
             <w:r>
               <w:rPr>
                 <w:b/>
                 <w:bCs/>
                 <w:color w:val="FFFFFF"/>
-              </w:rPr>
-              <w:t>Modularidad</w:t>
-            </w:r>
-            <w:proofErr w:type="spellEnd"/>
-            <w:proofErr w:type="gramEnd"/>
-            <w:r>
-              <w:rPr>
-                <w:b/>
-                <w:bCs/>
-                <w:color w:val="FFFFFF"/>
+                <w:lang w:val="es-CO"/>
               </w:rPr>
               <w:t xml:space="preserve"> del firmware</w:t>
             </w:r>
@@ -10759,12 +10592,6 @@
         </w:tc>
       </w:tr>
       <w:tr>
-        <w:tblPrEx>
-          <w:tblCellMar>
-            <w:top w:w="0" w:type="dxa"/>
-            <w:bottom w:w="0" w:type="dxa"/>
-          </w:tblCellMar>
-        </w:tblPrEx>
         <w:tc>
           <w:tcPr>
             <w:tcW w:w="2400" w:type="dxa"/>
@@ -10922,12 +10749,6 @@
         </w:tc>
       </w:tr>
       <w:tr>
-        <w:tblPrEx>
-          <w:tblCellMar>
-            <w:top w:w="0" w:type="dxa"/>
-            <w:bottom w:w="0" w:type="dxa"/>
-          </w:tblCellMar>
-        </w:tblPrEx>
         <w:tc>
           <w:tcPr>
             <w:tcW w:w="2400" w:type="dxa"/>
@@ -11092,12 +10913,6 @@
         </w:tc>
       </w:tr>
       <w:tr>
-        <w:tblPrEx>
-          <w:tblCellMar>
-            <w:top w:w="0" w:type="dxa"/>
-            <w:bottom w:w="0" w:type="dxa"/>
-          </w:tblCellMar>
-        </w:tblPrEx>
         <w:tc>
           <w:tcPr>
             <w:tcW w:w="2400" w:type="dxa"/>
@@ -11188,12 +11003,6 @@
         </w:tc>
       </w:tr>
       <w:tr>
-        <w:tblPrEx>
-          <w:tblCellMar>
-            <w:top w:w="0" w:type="dxa"/>
-            <w:bottom w:w="0" w:type="dxa"/>
-          </w:tblCellMar>
-        </w:tblPrEx>
         <w:tc>
           <w:tcPr>
             <w:tcW w:w="2400" w:type="dxa"/>
@@ -11349,7 +11158,7 @@
           <w:left w:w="10" w:type="dxa"/>
           <w:right w:w="10" w:type="dxa"/>
         </w:tblCellMar>
-        <w:tblLook w:val="04A0" w:firstRow="1" w:lastRow="0" w:firstColumn="1" w:lastColumn="0" w:noHBand="0" w:noVBand="1"/>
+        <w:tblLook w:val="0000" w:firstRow="0" w:lastRow="0" w:firstColumn="0" w:lastColumn="0" w:noHBand="0" w:noVBand="0"/>
       </w:tblPr>
       <w:tblGrid>
         <w:gridCol w:w="1560"/>
@@ -11358,12 +11167,6 @@
         <w:gridCol w:w="1800"/>
       </w:tblGrid>
       <w:tr>
-        <w:tblPrEx>
-          <w:tblCellMar>
-            <w:top w:w="0" w:type="dxa"/>
-            <w:bottom w:w="0" w:type="dxa"/>
-          </w:tblCellMar>
-        </w:tblPrEx>
         <w:trPr>
           <w:tblHeader/>
         </w:trPr>
@@ -11499,12 +11302,6 @@
         </w:tc>
       </w:tr>
       <w:tr>
-        <w:tblPrEx>
-          <w:tblCellMar>
-            <w:top w:w="0" w:type="dxa"/>
-            <w:bottom w:w="0" w:type="dxa"/>
-          </w:tblCellMar>
-        </w:tblPrEx>
         <w:tc>
           <w:tcPr>
             <w:tcW w:w="1560" w:type="dxa"/>
@@ -11691,12 +11488,6 @@
         </w:tc>
       </w:tr>
       <w:tr>
-        <w:tblPrEx>
-          <w:tblCellMar>
-            <w:top w:w="0" w:type="dxa"/>
-            <w:bottom w:w="0" w:type="dxa"/>
-          </w:tblCellMar>
-        </w:tblPrEx>
         <w:tc>
           <w:tcPr>
             <w:tcW w:w="1560" w:type="dxa"/>
@@ -11865,12 +11656,6 @@
         </w:tc>
       </w:tr>
       <w:tr>
-        <w:tblPrEx>
-          <w:tblCellMar>
-            <w:top w:w="0" w:type="dxa"/>
-            <w:bottom w:w="0" w:type="dxa"/>
-          </w:tblCellMar>
-        </w:tblPrEx>
         <w:tc>
           <w:tcPr>
             <w:tcW w:w="1560" w:type="dxa"/>
@@ -12075,12 +11860,6 @@
         </w:tc>
       </w:tr>
       <w:tr>
-        <w:tblPrEx>
-          <w:tblCellMar>
-            <w:top w:w="0" w:type="dxa"/>
-            <w:bottom w:w="0" w:type="dxa"/>
-          </w:tblCellMar>
-        </w:tblPrEx>
         <w:tc>
           <w:tcPr>
             <w:tcW w:w="1560" w:type="dxa"/>
@@ -12247,12 +12026,6 @@
         </w:tc>
       </w:tr>
       <w:tr>
-        <w:tblPrEx>
-          <w:tblCellMar>
-            <w:top w:w="0" w:type="dxa"/>
-            <w:bottom w:w="0" w:type="dxa"/>
-          </w:tblCellMar>
-        </w:tblPrEx>
         <w:tc>
           <w:tcPr>
             <w:tcW w:w="1560" w:type="dxa"/>
@@ -12642,7 +12415,21 @@
         <w:rPr>
           <w:lang w:val="es-CO"/>
         </w:rPr>
-        <w:t>se utiliza cuando el test case no puede ejecutarse por una dependencia externa (hardware faltante, periférico sin disponibilidad), para diferenciarlo de un fallo real.</w:t>
+        <w:t xml:space="preserve">se utiliza cuando </w:t>
+      </w:r>
+      <w:proofErr w:type="gramStart"/>
+      <w:r>
+        <w:rPr>
+          <w:lang w:val="es-CO"/>
+        </w:rPr>
+        <w:t>el test</w:t>
+      </w:r>
+      <w:proofErr w:type="gramEnd"/>
+      <w:r>
+        <w:rPr>
+          <w:lang w:val="es-CO"/>
+        </w:rPr>
+        <w:t xml:space="preserve"> case no puede ejecutarse por una dependencia externa (hardware faltante, periférico sin disponibilidad), para diferenciarlo de un fallo real.</w:t>
       </w:r>
     </w:p>
     <w:p>
@@ -12682,19 +12469,13 @@
           <w:left w:w="10" w:type="dxa"/>
           <w:right w:w="10" w:type="dxa"/>
         </w:tblCellMar>
-        <w:tblLook w:val="04A0" w:firstRow="1" w:lastRow="0" w:firstColumn="1" w:lastColumn="0" w:noHBand="0" w:noVBand="1"/>
+        <w:tblLook w:val="0000" w:firstRow="0" w:lastRow="0" w:firstColumn="0" w:lastColumn="0" w:noHBand="0" w:noVBand="0"/>
       </w:tblPr>
       <w:tblGrid>
         <w:gridCol w:w="3120"/>
         <w:gridCol w:w="6240"/>
       </w:tblGrid>
       <w:tr>
-        <w:tblPrEx>
-          <w:tblCellMar>
-            <w:top w:w="0" w:type="dxa"/>
-            <w:bottom w:w="0" w:type="dxa"/>
-          </w:tblCellMar>
-        </w:tblPrEx>
         <w:trPr>
           <w:tblHeader/>
         </w:trPr>
@@ -12764,12 +12545,6 @@
         </w:tc>
       </w:tr>
       <w:tr>
-        <w:tblPrEx>
-          <w:tblCellMar>
-            <w:top w:w="0" w:type="dxa"/>
-            <w:bottom w:w="0" w:type="dxa"/>
-          </w:tblCellMar>
-        </w:tblPrEx>
         <w:tc>
           <w:tcPr>
             <w:tcW w:w="3120" w:type="dxa"/>
@@ -12891,12 +12666,6 @@
         </w:tc>
       </w:tr>
       <w:tr>
-        <w:tblPrEx>
-          <w:tblCellMar>
-            <w:top w:w="0" w:type="dxa"/>
-            <w:bottom w:w="0" w:type="dxa"/>
-          </w:tblCellMar>
-        </w:tblPrEx>
         <w:tc>
           <w:tcPr>
             <w:tcW w:w="3120" w:type="dxa"/>
@@ -12992,12 +12761,6 @@
         </w:tc>
       </w:tr>
       <w:tr>
-        <w:tblPrEx>
-          <w:tblCellMar>
-            <w:top w:w="0" w:type="dxa"/>
-            <w:bottom w:w="0" w:type="dxa"/>
-          </w:tblCellMar>
-        </w:tblPrEx>
         <w:tc>
           <w:tcPr>
             <w:tcW w:w="3120" w:type="dxa"/>
@@ -13068,12 +12831,6 @@
         </w:tc>
       </w:tr>
       <w:tr>
-        <w:tblPrEx>
-          <w:tblCellMar>
-            <w:top w:w="0" w:type="dxa"/>
-            <w:bottom w:w="0" w:type="dxa"/>
-          </w:tblCellMar>
-        </w:tblPrEx>
         <w:tc>
           <w:tcPr>
             <w:tcW w:w="3120" w:type="dxa"/>
@@ -13144,12 +12901,6 @@
         </w:tc>
       </w:tr>
       <w:tr>
-        <w:tblPrEx>
-          <w:tblCellMar>
-            <w:top w:w="0" w:type="dxa"/>
-            <w:bottom w:w="0" w:type="dxa"/>
-          </w:tblCellMar>
-        </w:tblPrEx>
         <w:tc>
           <w:tcPr>
             <w:tcW w:w="3120" w:type="dxa"/>
@@ -13217,12 +12968,6 @@
         </w:tc>
       </w:tr>
       <w:tr>
-        <w:tblPrEx>
-          <w:tblCellMar>
-            <w:top w:w="0" w:type="dxa"/>
-            <w:bottom w:w="0" w:type="dxa"/>
-          </w:tblCellMar>
-        </w:tblPrEx>
         <w:tc>
           <w:tcPr>
             <w:tcW w:w="3120" w:type="dxa"/>
@@ -13327,12 +13072,6 @@
         </w:tc>
       </w:tr>
       <w:tr>
-        <w:tblPrEx>
-          <w:tblCellMar>
-            <w:top w:w="0" w:type="dxa"/>
-            <w:bottom w:w="0" w:type="dxa"/>
-          </w:tblCellMar>
-        </w:tblPrEx>
         <w:tc>
           <w:tcPr>
             <w:tcW w:w="3120" w:type="dxa"/>
@@ -13581,7 +13320,21 @@
           <w:lang w:val="es-CO"/>
         </w:rPr>
         <w:lastRenderedPageBreak/>
-        <w:t>5. Plantilla de Test Case</w:t>
+        <w:t xml:space="preserve">5. Plantilla </w:t>
+      </w:r>
+      <w:proofErr w:type="gramStart"/>
+      <w:r>
+        <w:rPr>
+          <w:lang w:val="es-CO"/>
+        </w:rPr>
+        <w:t>de Test</w:t>
+      </w:r>
+      <w:proofErr w:type="gramEnd"/>
+      <w:r>
+        <w:rPr>
+          <w:lang w:val="es-CO"/>
+        </w:rPr>
+        <w:t xml:space="preserve"> Case</w:t>
       </w:r>
     </w:p>
     <w:p>
@@ -13628,19 +13381,13 @@
           <w:left w:w="10" w:type="dxa"/>
           <w:right w:w="10" w:type="dxa"/>
         </w:tblCellMar>
-        <w:tblLook w:val="04A0" w:firstRow="1" w:lastRow="0" w:firstColumn="1" w:lastColumn="0" w:noHBand="0" w:noVBand="1"/>
+        <w:tblLook w:val="0000" w:firstRow="0" w:lastRow="0" w:firstColumn="0" w:lastColumn="0" w:noHBand="0" w:noVBand="0"/>
       </w:tblPr>
       <w:tblGrid>
         <w:gridCol w:w="4992"/>
         <w:gridCol w:w="4368"/>
       </w:tblGrid>
       <w:tr>
-        <w:tblPrEx>
-          <w:tblCellMar>
-            <w:top w:w="0" w:type="dxa"/>
-            <w:bottom w:w="0" w:type="dxa"/>
-          </w:tblCellMar>
-        </w:tblPrEx>
         <w:tc>
           <w:tcPr>
             <w:tcW w:w="7360" w:type="dxa"/>
@@ -13743,12 +13490,6 @@
         </w:tc>
       </w:tr>
       <w:tr>
-        <w:tblPrEx>
-          <w:tblCellMar>
-            <w:top w:w="0" w:type="dxa"/>
-            <w:bottom w:w="0" w:type="dxa"/>
-          </w:tblCellMar>
-        </w:tblPrEx>
         <w:tc>
           <w:tcPr>
             <w:tcW w:w="9360" w:type="dxa"/>
@@ -13785,12 +13526,6 @@
         </w:tc>
       </w:tr>
       <w:tr>
-        <w:tblPrEx>
-          <w:tblCellMar>
-            <w:top w:w="0" w:type="dxa"/>
-            <w:bottom w:w="0" w:type="dxa"/>
-          </w:tblCellMar>
-        </w:tblPrEx>
         <w:tc>
           <w:tcPr>
             <w:tcW w:w="2800" w:type="dxa"/>
@@ -13850,12 +13585,6 @@
         </w:tc>
       </w:tr>
       <w:tr>
-        <w:tblPrEx>
-          <w:tblCellMar>
-            <w:top w:w="0" w:type="dxa"/>
-            <w:bottom w:w="0" w:type="dxa"/>
-          </w:tblCellMar>
-        </w:tblPrEx>
         <w:tc>
           <w:tcPr>
             <w:tcW w:w="2800" w:type="dxa"/>
@@ -13915,12 +13644,6 @@
         </w:tc>
       </w:tr>
       <w:tr>
-        <w:tblPrEx>
-          <w:tblCellMar>
-            <w:top w:w="0" w:type="dxa"/>
-            <w:bottom w:w="0" w:type="dxa"/>
-          </w:tblCellMar>
-        </w:tblPrEx>
         <w:tc>
           <w:tcPr>
             <w:tcW w:w="2800" w:type="dxa"/>
@@ -13980,12 +13703,6 @@
         </w:tc>
       </w:tr>
       <w:tr>
-        <w:tblPrEx>
-          <w:tblCellMar>
-            <w:top w:w="0" w:type="dxa"/>
-            <w:bottom w:w="0" w:type="dxa"/>
-          </w:tblCellMar>
-        </w:tblPrEx>
         <w:tc>
           <w:tcPr>
             <w:tcW w:w="2800" w:type="dxa"/>
@@ -14076,12 +13793,6 @@
         </w:tc>
       </w:tr>
       <w:tr>
-        <w:tblPrEx>
-          <w:tblCellMar>
-            <w:top w:w="0" w:type="dxa"/>
-            <w:bottom w:w="0" w:type="dxa"/>
-          </w:tblCellMar>
-        </w:tblPrEx>
         <w:tc>
           <w:tcPr>
             <w:tcW w:w="2800" w:type="dxa"/>
@@ -14141,12 +13852,6 @@
         </w:tc>
       </w:tr>
       <w:tr>
-        <w:tblPrEx>
-          <w:tblCellMar>
-            <w:top w:w="0" w:type="dxa"/>
-            <w:bottom w:w="0" w:type="dxa"/>
-          </w:tblCellMar>
-        </w:tblPrEx>
         <w:tc>
           <w:tcPr>
             <w:tcW w:w="2800" w:type="dxa"/>
@@ -14206,12 +13911,6 @@
         </w:tc>
       </w:tr>
       <w:tr>
-        <w:tblPrEx>
-          <w:tblCellMar>
-            <w:top w:w="0" w:type="dxa"/>
-            <w:bottom w:w="0" w:type="dxa"/>
-          </w:tblCellMar>
-        </w:tblPrEx>
         <w:tc>
           <w:tcPr>
             <w:tcW w:w="2800" w:type="dxa"/>
@@ -14271,12 +13970,6 @@
         </w:tc>
       </w:tr>
       <w:tr>
-        <w:tblPrEx>
-          <w:tblCellMar>
-            <w:top w:w="0" w:type="dxa"/>
-            <w:bottom w:w="0" w:type="dxa"/>
-          </w:tblCellMar>
-        </w:tblPrEx>
         <w:tc>
           <w:tcPr>
             <w:tcW w:w="4680" w:type="dxa"/>
@@ -14345,12 +14038,6 @@
         </w:tc>
       </w:tr>
       <w:tr>
-        <w:tblPrEx>
-          <w:tblCellMar>
-            <w:top w:w="0" w:type="dxa"/>
-            <w:bottom w:w="0" w:type="dxa"/>
-          </w:tblCellMar>
-        </w:tblPrEx>
         <w:tc>
           <w:tcPr>
             <w:tcW w:w="4680" w:type="dxa"/>
@@ -14417,12 +14104,6 @@
         </w:tc>
       </w:tr>
       <w:tr>
-        <w:tblPrEx>
-          <w:tblCellMar>
-            <w:top w:w="0" w:type="dxa"/>
-            <w:bottom w:w="0" w:type="dxa"/>
-          </w:tblCellMar>
-        </w:tblPrEx>
         <w:tc>
           <w:tcPr>
             <w:tcW w:w="9360" w:type="dxa"/>
@@ -14456,12 +14137,6 @@
         </w:tc>
       </w:tr>
       <w:tr>
-        <w:tblPrEx>
-          <w:tblCellMar>
-            <w:top w:w="0" w:type="dxa"/>
-            <w:bottom w:w="0" w:type="dxa"/>
-          </w:tblCellMar>
-        </w:tblPrEx>
         <w:tc>
           <w:tcPr>
             <w:tcW w:w="9360" w:type="dxa"/>
@@ -14497,12 +14172,6 @@
         </w:tc>
       </w:tr>
       <w:tr>
-        <w:tblPrEx>
-          <w:tblCellMar>
-            <w:top w:w="0" w:type="dxa"/>
-            <w:bottom w:w="0" w:type="dxa"/>
-          </w:tblCellMar>
-        </w:tblPrEx>
         <w:tc>
           <w:tcPr>
             <w:tcW w:w="4680" w:type="dxa"/>
@@ -14565,12 +14234,6 @@
         </w:tc>
       </w:tr>
       <w:tr>
-        <w:tblPrEx>
-          <w:tblCellMar>
-            <w:top w:w="0" w:type="dxa"/>
-            <w:bottom w:w="0" w:type="dxa"/>
-          </w:tblCellMar>
-        </w:tblPrEx>
         <w:tc>
           <w:tcPr>
             <w:tcW w:w="4680" w:type="dxa"/>
@@ -15076,7 +14739,7 @@
           <w:left w:w="10" w:type="dxa"/>
           <w:right w:w="10" w:type="dxa"/>
         </w:tblCellMar>
-        <w:tblLook w:val="04A0" w:firstRow="1" w:lastRow="0" w:firstColumn="1" w:lastColumn="0" w:noHBand="0" w:noVBand="1"/>
+        <w:tblLook w:val="0000" w:firstRow="0" w:lastRow="0" w:firstColumn="0" w:lastColumn="0" w:noHBand="0" w:noVBand="0"/>
       </w:tblPr>
       <w:tblGrid>
         <w:gridCol w:w="1100"/>
@@ -15086,12 +14749,6 @@
         <w:gridCol w:w="1800"/>
       </w:tblGrid>
       <w:tr>
-        <w:tblPrEx>
-          <w:tblCellMar>
-            <w:top w:w="0" w:type="dxa"/>
-            <w:bottom w:w="0" w:type="dxa"/>
-          </w:tblCellMar>
-        </w:tblPrEx>
         <w:trPr>
           <w:tblHeader/>
         </w:trPr>
@@ -15252,12 +14909,6 @@
         </w:tc>
       </w:tr>
       <w:tr>
-        <w:tblPrEx>
-          <w:tblCellMar>
-            <w:top w:w="0" w:type="dxa"/>
-            <w:bottom w:w="0" w:type="dxa"/>
-          </w:tblCellMar>
-        </w:tblPrEx>
         <w:tc>
           <w:tcPr>
             <w:tcW w:w="1100" w:type="dxa"/>
@@ -15424,12 +15075,6 @@
         </w:tc>
       </w:tr>
       <w:tr>
-        <w:tblPrEx>
-          <w:tblCellMar>
-            <w:top w:w="0" w:type="dxa"/>
-            <w:bottom w:w="0" w:type="dxa"/>
-          </w:tblCellMar>
-        </w:tblPrEx>
         <w:tc>
           <w:tcPr>
             <w:tcW w:w="1100" w:type="dxa"/>
@@ -15621,12 +15266,6 @@
         </w:tc>
       </w:tr>
       <w:tr>
-        <w:tblPrEx>
-          <w:tblCellMar>
-            <w:top w:w="0" w:type="dxa"/>
-            <w:bottom w:w="0" w:type="dxa"/>
-          </w:tblCellMar>
-        </w:tblPrEx>
         <w:tc>
           <w:tcPr>
             <w:tcW w:w="1100" w:type="dxa"/>
@@ -15777,12 +15416,6 @@
         </w:tc>
       </w:tr>
       <w:tr>
-        <w:tblPrEx>
-          <w:tblCellMar>
-            <w:top w:w="0" w:type="dxa"/>
-            <w:bottom w:w="0" w:type="dxa"/>
-          </w:tblCellMar>
-        </w:tblPrEx>
         <w:tc>
           <w:tcPr>
             <w:tcW w:w="1100" w:type="dxa"/>
@@ -15933,12 +15566,6 @@
         </w:tc>
       </w:tr>
       <w:tr>
-        <w:tblPrEx>
-          <w:tblCellMar>
-            <w:top w:w="0" w:type="dxa"/>
-            <w:bottom w:w="0" w:type="dxa"/>
-          </w:tblCellMar>
-        </w:tblPrEx>
         <w:tc>
           <w:tcPr>
             <w:tcW w:w="1100" w:type="dxa"/>
@@ -16089,12 +15716,6 @@
         </w:tc>
       </w:tr>
       <w:tr>
-        <w:tblPrEx>
-          <w:tblCellMar>
-            <w:top w:w="0" w:type="dxa"/>
-            <w:bottom w:w="0" w:type="dxa"/>
-          </w:tblCellMar>
-        </w:tblPrEx>
         <w:tc>
           <w:tcPr>
             <w:tcW w:w="1100" w:type="dxa"/>
@@ -16251,12 +15872,6 @@
         </w:tc>
       </w:tr>
       <w:tr>
-        <w:tblPrEx>
-          <w:tblCellMar>
-            <w:top w:w="0" w:type="dxa"/>
-            <w:bottom w:w="0" w:type="dxa"/>
-          </w:tblCellMar>
-        </w:tblPrEx>
         <w:tc>
           <w:tcPr>
             <w:tcW w:w="1100" w:type="dxa"/>
@@ -16416,12 +16031,6 @@
         </w:tc>
       </w:tr>
       <w:tr>
-        <w:tblPrEx>
-          <w:tblCellMar>
-            <w:top w:w="0" w:type="dxa"/>
-            <w:bottom w:w="0" w:type="dxa"/>
-          </w:tblCellMar>
-        </w:tblPrEx>
         <w:tc>
           <w:tcPr>
             <w:tcW w:w="1100" w:type="dxa"/>
@@ -16572,12 +16181,6 @@
         </w:tc>
       </w:tr>
       <w:tr>
-        <w:tblPrEx>
-          <w:tblCellMar>
-            <w:top w:w="0" w:type="dxa"/>
-            <w:bottom w:w="0" w:type="dxa"/>
-          </w:tblCellMar>
-        </w:tblPrEx>
         <w:tc>
           <w:tcPr>
             <w:tcW w:w="1100" w:type="dxa"/>
@@ -16728,12 +16331,6 @@
         </w:tc>
       </w:tr>
       <w:tr>
-        <w:tblPrEx>
-          <w:tblCellMar>
-            <w:top w:w="0" w:type="dxa"/>
-            <w:bottom w:w="0" w:type="dxa"/>
-          </w:tblCellMar>
-        </w:tblPrEx>
         <w:tc>
           <w:tcPr>
             <w:tcW w:w="1100" w:type="dxa"/>
@@ -16893,12 +16490,6 @@
         </w:tc>
       </w:tr>
       <w:tr>
-        <w:tblPrEx>
-          <w:tblCellMar>
-            <w:top w:w="0" w:type="dxa"/>
-            <w:bottom w:w="0" w:type="dxa"/>
-          </w:tblCellMar>
-        </w:tblPrEx>
         <w:tc>
           <w:tcPr>
             <w:tcW w:w="1100" w:type="dxa"/>
@@ -17049,12 +16640,6 @@
         </w:tc>
       </w:tr>
       <w:tr>
-        <w:tblPrEx>
-          <w:tblCellMar>
-            <w:top w:w="0" w:type="dxa"/>
-            <w:bottom w:w="0" w:type="dxa"/>
-          </w:tblCellMar>
-        </w:tblPrEx>
         <w:tc>
           <w:tcPr>
             <w:tcW w:w="1100" w:type="dxa"/>
@@ -17211,12 +16796,6 @@
         </w:tc>
       </w:tr>
       <w:tr>
-        <w:tblPrEx>
-          <w:tblCellMar>
-            <w:top w:w="0" w:type="dxa"/>
-            <w:bottom w:w="0" w:type="dxa"/>
-          </w:tblCellMar>
-        </w:tblPrEx>
         <w:tc>
           <w:tcPr>
             <w:tcW w:w="1100" w:type="dxa"/>
@@ -17385,12 +16964,6 @@
         </w:tc>
       </w:tr>
       <w:tr>
-        <w:tblPrEx>
-          <w:tblCellMar>
-            <w:top w:w="0" w:type="dxa"/>
-            <w:bottom w:w="0" w:type="dxa"/>
-          </w:tblCellMar>
-        </w:tblPrEx>
         <w:tc>
           <w:tcPr>
             <w:tcW w:w="1100" w:type="dxa"/>
@@ -17566,12 +17139,6 @@
         </w:tc>
       </w:tr>
       <w:tr>
-        <w:tblPrEx>
-          <w:tblCellMar>
-            <w:top w:w="0" w:type="dxa"/>
-            <w:bottom w:w="0" w:type="dxa"/>
-          </w:tblCellMar>
-        </w:tblPrEx>
         <w:tc>
           <w:tcPr>
             <w:tcW w:w="1100" w:type="dxa"/>
@@ -17728,12 +17295,6 @@
         </w:tc>
       </w:tr>
       <w:tr>
-        <w:tblPrEx>
-          <w:tblCellMar>
-            <w:top w:w="0" w:type="dxa"/>
-            <w:bottom w:w="0" w:type="dxa"/>
-          </w:tblCellMar>
-        </w:tblPrEx>
         <w:tc>
           <w:tcPr>
             <w:tcW w:w="1100" w:type="dxa"/>
@@ -17906,12 +17467,6 @@
         </w:tc>
       </w:tr>
       <w:tr>
-        <w:tblPrEx>
-          <w:tblCellMar>
-            <w:top w:w="0" w:type="dxa"/>
-            <w:bottom w:w="0" w:type="dxa"/>
-          </w:tblCellMar>
-        </w:tblPrEx>
         <w:tc>
           <w:tcPr>
             <w:tcW w:w="1100" w:type="dxa"/>
@@ -18096,12 +17651,6 @@
         </w:tc>
       </w:tr>
       <w:tr>
-        <w:tblPrEx>
-          <w:tblCellMar>
-            <w:top w:w="0" w:type="dxa"/>
-            <w:bottom w:w="0" w:type="dxa"/>
-          </w:tblCellMar>
-        </w:tblPrEx>
         <w:tc>
           <w:tcPr>
             <w:tcW w:w="1100" w:type="dxa"/>
@@ -18262,12 +17811,6 @@
         </w:tc>
       </w:tr>
       <w:tr>
-        <w:tblPrEx>
-          <w:tblCellMar>
-            <w:top w:w="0" w:type="dxa"/>
-            <w:bottom w:w="0" w:type="dxa"/>
-          </w:tblCellMar>
-        </w:tblPrEx>
         <w:tc>
           <w:tcPr>
             <w:tcW w:w="1100" w:type="dxa"/>
@@ -18450,6 +17993,10 @@
     <w:p>
       <w:pPr>
         <w:spacing w:before="400"/>
+        <w:jc w:val="center"/>
+        <w:rPr>
+          <w:lang w:val="es-CO"/>
+        </w:rPr>
       </w:pPr>
     </w:p>
     <w:sectPr>
@@ -18502,7 +18049,27 @@
         <w:szCs w:val="18"/>
         <w:lang w:val="es-CO"/>
       </w:rPr>
-      <w:t xml:space="preserve">Entrega 2 — SRS, Plan de Pruebas y SRTM  |  Página </w:t>
+      <w:t xml:space="preserve">Entrega 2 — SRS, Plan de Pruebas y </w:t>
+    </w:r>
+    <w:proofErr w:type="gramStart"/>
+    <w:r>
+      <w:rPr>
+        <w:color w:val="595959"/>
+        <w:sz w:val="18"/>
+        <w:szCs w:val="18"/>
+        <w:lang w:val="es-CO"/>
+      </w:rPr>
+      <w:t>SRTM  |</w:t>
+    </w:r>
+    <w:proofErr w:type="gramEnd"/>
+    <w:r>
+      <w:rPr>
+        <w:color w:val="595959"/>
+        <w:sz w:val="18"/>
+        <w:szCs w:val="18"/>
+        <w:lang w:val="es-CO"/>
+      </w:rPr>
+      <w:t xml:space="preserve">  Página </w:t>
     </w:r>
     <w:r>
       <w:rPr>
@@ -18691,64 +18258,10 @@
 <file path=word/numbering.xml><?xml version="1.0" encoding="utf-8"?>
 <w:numbering xmlns:wpc="http://schemas.microsoft.com/office/word/2010/wordprocessingCanvas" xmlns:cx="http://schemas.microsoft.com/office/drawing/2014/chartex" xmlns:cx1="http://schemas.microsoft.com/office/drawing/2015/9/8/chartex" xmlns:cx2="http://schemas.microsoft.com/office/drawing/2015/10/21/chartex" xmlns:cx3="http://schemas.microsoft.com/office/drawing/2016/5/9/chartex" xmlns:cx4="http://schemas.microsoft.com/office/drawing/2016/5/10/chartex" xmlns:cx5="http://schemas.microsoft.com/office/drawing/2016/5/11/chartex" xmlns:cx6="http://schemas.microsoft.com/office/drawing/2016/5/12/chartex" xmlns:cx7="http://schemas.microsoft.com/office/drawing/2016/5/13/chartex" xmlns:cx8="http://schemas.microsoft.com/office/drawing/2016/5/14/chartex" xmlns:mc="http://schemas.openxmlformats.org/markup-compatibility/2006" xmlns:aink="http://schemas.microsoft.com/office/drawing/2016/ink" xmlns:am3d="http://schemas.microsoft.com/office/drawing/2017/model3d" xmlns:o="urn:schemas-microsoft-com:office:office" xmlns:oel="http://schemas.microsoft.com/office/2019/extlst" xmlns:r="http://schemas.openxmlformats.org/officeDocument/2006/relationships" xmlns:m="http://schemas.openxmlformats.org/officeDocument/2006/math" xmlns:v="urn:schemas-microsoft-com:vml" xmlns:wp14="http://schemas.microsoft.com/office/word/2010/wordprocessingDrawing" xmlns:wp="http://schemas.openxmlformats.org/drawingml/2006/wordprocessingDrawing" xmlns:w10="urn:schemas-microsoft-com:office:word" xmlns:w="http://schemas.openxmlformats.org/wordprocessingml/2006/main" xmlns:w14="http://schemas.microsoft.com/office/word/2010/wordml" xmlns:w15="http://schemas.microsoft.com/office/word/2012/wordml" xmlns:w16cex="http://schemas.microsoft.com/office/word/2018/wordml/cex" xmlns:w16cid="http://schemas.microsoft.com/office/word/2016/wordml/cid" xmlns:w16="http://schemas.microsoft.com/office/word/2018/wordml" xmlns:w16du="http://schemas.microsoft.com/office/word/2023/wordml/word16du" xmlns:w16sdtdh="http://schemas.microsoft.com/office/word/2020/wordml/sdtdatahash" xmlns:w16sdtfl="http://schemas.microsoft.com/office/word/2024/wordml/sdtformatlock" xmlns:w16se="http://schemas.microsoft.com/office/word/2015/wordml/symex" xmlns:wpg="http://schemas.microsoft.com/office/word/2010/wordprocessingGroup" xmlns:wpi="http://schemas.microsoft.com/office/word/2010/wordprocessingInk" xmlns:wne="http://schemas.microsoft.com/office/word/2006/wordml" xmlns:wps="http://schemas.microsoft.com/office/word/2010/wordprocessingShape" mc:Ignorable="w14 w15 w16se w16cid w16 w16cex w16sdtdh w16sdtfl w16du wp14">
   <w:abstractNum w:abstractNumId="0" w15:restartNumberingAfterBreak="0">
-    <w:nsid w:val="59E43DCE"/>
+    <w:nsid w:val="02262B01"/>
     <w:multiLevelType w:val="hybridMultilevel"/>
-    <w:tmpl w:val="87346396"/>
-    <w:lvl w:ilvl="0" w:tplc="DBE0C5E0">
-      <w:start w:val="1"/>
-      <w:numFmt w:val="bullet"/>
-      <w:lvlText w:val="•"/>
-      <w:lvlJc w:val="left"/>
-      <w:pPr>
-        <w:ind w:left="720" w:hanging="360"/>
-      </w:pPr>
-    </w:lvl>
-    <w:lvl w:ilvl="1" w:tplc="DE6EB88E">
-      <w:numFmt w:val="decimal"/>
-      <w:lvlText w:val=""/>
-      <w:lvlJc w:val="left"/>
-    </w:lvl>
-    <w:lvl w:ilvl="2" w:tplc="A46EA208">
-      <w:numFmt w:val="decimal"/>
-      <w:lvlText w:val=""/>
-      <w:lvlJc w:val="left"/>
-    </w:lvl>
-    <w:lvl w:ilvl="3" w:tplc="A1EAF8BA">
-      <w:numFmt w:val="decimal"/>
-      <w:lvlText w:val=""/>
-      <w:lvlJc w:val="left"/>
-    </w:lvl>
-    <w:lvl w:ilvl="4" w:tplc="B6D6CB64">
-      <w:numFmt w:val="decimal"/>
-      <w:lvlText w:val=""/>
-      <w:lvlJc w:val="left"/>
-    </w:lvl>
-    <w:lvl w:ilvl="5" w:tplc="66BA490A">
-      <w:numFmt w:val="decimal"/>
-      <w:lvlText w:val=""/>
-      <w:lvlJc w:val="left"/>
-    </w:lvl>
-    <w:lvl w:ilvl="6" w:tplc="5206053A">
-      <w:numFmt w:val="decimal"/>
-      <w:lvlText w:val=""/>
-      <w:lvlJc w:val="left"/>
-    </w:lvl>
-    <w:lvl w:ilvl="7" w:tplc="BFD0265C">
-      <w:numFmt w:val="decimal"/>
-      <w:lvlText w:val=""/>
-      <w:lvlJc w:val="left"/>
-    </w:lvl>
-    <w:lvl w:ilvl="8" w:tplc="F528A7E8">
-      <w:numFmt w:val="decimal"/>
-      <w:lvlText w:val=""/>
-      <w:lvlJc w:val="left"/>
-    </w:lvl>
-  </w:abstractNum>
-  <w:abstractNum w:abstractNumId="1" w15:restartNumberingAfterBreak="0">
-    <w:nsid w:val="6AF63CD8"/>
-    <w:multiLevelType w:val="hybridMultilevel"/>
-    <w:tmpl w:val="F62EC410"/>
-    <w:lvl w:ilvl="0" w:tplc="52F29106">
+    <w:tmpl w:val="5666E9CE"/>
+    <w:lvl w:ilvl="0" w:tplc="296445D6">
       <w:start w:val="1"/>
       <w:numFmt w:val="bullet"/>
       <w:lvlText w:val="●"/>
@@ -18757,7 +18270,7 @@
         <w:ind w:left="720" w:hanging="360"/>
       </w:pPr>
     </w:lvl>
-    <w:lvl w:ilvl="1" w:tplc="3B5C979E">
+    <w:lvl w:ilvl="1" w:tplc="7BEEC24C">
       <w:start w:val="1"/>
       <w:numFmt w:val="bullet"/>
       <w:lvlText w:val="○"/>
@@ -18766,7 +18279,7 @@
         <w:ind w:left="1440" w:hanging="360"/>
       </w:pPr>
     </w:lvl>
-    <w:lvl w:ilvl="2" w:tplc="2E1A0A76">
+    <w:lvl w:ilvl="2" w:tplc="58E0E17C">
       <w:start w:val="1"/>
       <w:numFmt w:val="bullet"/>
       <w:lvlText w:val="■"/>
@@ -18775,7 +18288,7 @@
         <w:ind w:left="2160" w:hanging="360"/>
       </w:pPr>
     </w:lvl>
-    <w:lvl w:ilvl="3" w:tplc="D2DE1D52">
+    <w:lvl w:ilvl="3" w:tplc="E6FCD232">
       <w:start w:val="1"/>
       <w:numFmt w:val="bullet"/>
       <w:lvlText w:val="●"/>
@@ -18784,7 +18297,7 @@
         <w:ind w:left="2880" w:hanging="360"/>
       </w:pPr>
     </w:lvl>
-    <w:lvl w:ilvl="4" w:tplc="48401826">
+    <w:lvl w:ilvl="4" w:tplc="6DC82088">
       <w:start w:val="1"/>
       <w:numFmt w:val="bullet"/>
       <w:lvlText w:val="○"/>
@@ -18793,7 +18306,7 @@
         <w:ind w:left="3600" w:hanging="360"/>
       </w:pPr>
     </w:lvl>
-    <w:lvl w:ilvl="5" w:tplc="ED3A931A">
+    <w:lvl w:ilvl="5" w:tplc="71B4AB42">
       <w:start w:val="1"/>
       <w:numFmt w:val="bullet"/>
       <w:lvlText w:val="■"/>
@@ -18802,7 +18315,7 @@
         <w:ind w:left="4320" w:hanging="360"/>
       </w:pPr>
     </w:lvl>
-    <w:lvl w:ilvl="6" w:tplc="C632228A">
+    <w:lvl w:ilvl="6" w:tplc="8092F492">
       <w:start w:val="1"/>
       <w:numFmt w:val="bullet"/>
       <w:lvlText w:val="●"/>
@@ -18811,7 +18324,7 @@
         <w:ind w:left="5040" w:hanging="360"/>
       </w:pPr>
     </w:lvl>
-    <w:lvl w:ilvl="7" w:tplc="7E32D4EE">
+    <w:lvl w:ilvl="7" w:tplc="28AE255E">
       <w:start w:val="1"/>
       <w:numFmt w:val="bullet"/>
       <w:lvlText w:val="●"/>
@@ -18820,7 +18333,7 @@
         <w:ind w:left="5760" w:hanging="360"/>
       </w:pPr>
     </w:lvl>
-    <w:lvl w:ilvl="8" w:tplc="38EC0BA2">
+    <w:lvl w:ilvl="8" w:tplc="FA0055C8">
       <w:start w:val="1"/>
       <w:numFmt w:val="bullet"/>
       <w:lvlText w:val="●"/>
@@ -18830,14 +18343,68 @@
       </w:pPr>
     </w:lvl>
   </w:abstractNum>
-  <w:num w:numId="1" w16cid:durableId="1893538862">
-    <w:abstractNumId w:val="1"/>
+  <w:abstractNum w:abstractNumId="1" w15:restartNumberingAfterBreak="0">
+    <w:nsid w:val="2B395C26"/>
+    <w:multiLevelType w:val="hybridMultilevel"/>
+    <w:tmpl w:val="D86AF3C2"/>
+    <w:lvl w:ilvl="0" w:tplc="F5102124">
+      <w:start w:val="1"/>
+      <w:numFmt w:val="bullet"/>
+      <w:lvlText w:val="•"/>
+      <w:lvlJc w:val="left"/>
+      <w:pPr>
+        <w:ind w:left="720" w:hanging="360"/>
+      </w:pPr>
+    </w:lvl>
+    <w:lvl w:ilvl="1" w:tplc="BB6CBBDE">
+      <w:numFmt w:val="decimal"/>
+      <w:lvlText w:val=""/>
+      <w:lvlJc w:val="left"/>
+    </w:lvl>
+    <w:lvl w:ilvl="2" w:tplc="A8928D34">
+      <w:numFmt w:val="decimal"/>
+      <w:lvlText w:val=""/>
+      <w:lvlJc w:val="left"/>
+    </w:lvl>
+    <w:lvl w:ilvl="3" w:tplc="6C8462A8">
+      <w:numFmt w:val="decimal"/>
+      <w:lvlText w:val=""/>
+      <w:lvlJc w:val="left"/>
+    </w:lvl>
+    <w:lvl w:ilvl="4" w:tplc="31E47EBC">
+      <w:numFmt w:val="decimal"/>
+      <w:lvlText w:val=""/>
+      <w:lvlJc w:val="left"/>
+    </w:lvl>
+    <w:lvl w:ilvl="5" w:tplc="6D5822EC">
+      <w:numFmt w:val="decimal"/>
+      <w:lvlText w:val=""/>
+      <w:lvlJc w:val="left"/>
+    </w:lvl>
+    <w:lvl w:ilvl="6" w:tplc="0C58E548">
+      <w:numFmt w:val="decimal"/>
+      <w:lvlText w:val=""/>
+      <w:lvlJc w:val="left"/>
+    </w:lvl>
+    <w:lvl w:ilvl="7" w:tplc="8280CC94">
+      <w:numFmt w:val="decimal"/>
+      <w:lvlText w:val=""/>
+      <w:lvlJc w:val="left"/>
+    </w:lvl>
+    <w:lvl w:ilvl="8" w:tplc="C904201C">
+      <w:numFmt w:val="decimal"/>
+      <w:lvlText w:val=""/>
+      <w:lvlJc w:val="left"/>
+    </w:lvl>
+  </w:abstractNum>
+  <w:num w:numId="1" w16cid:durableId="1258520183">
+    <w:abstractNumId w:val="0"/>
     <w:lvlOverride w:ilvl="0">
       <w:startOverride w:val="1"/>
     </w:lvlOverride>
   </w:num>
-  <w:num w:numId="2" w16cid:durableId="201286164">
-    <w:abstractNumId w:val="0"/>
+  <w:num w:numId="2" w16cid:durableId="1455442342">
+    <w:abstractNumId w:val="1"/>
     <w:lvlOverride w:ilvl="0">
       <w:startOverride w:val="1"/>
     </w:lvlOverride>

</xml_diff>